<commit_message>
Update The Chapter Teo
</commit_message>
<xml_diff>
--- a/HealtCareProject.docx
+++ b/HealtCareProject.docx
@@ -6272,8 +6272,9 @@
     <w:p>
       <w:pPr>
         <w:rPr>
-          <w:rFonts w:asciiTheme="majorBidi" w:hAnsiTheme="majorBidi"/>
-          <w:sz w:val="28"/>
+          <w:rFonts w:asciiTheme="majorBidi" w:hAnsiTheme="majorBidi" w:hint="cs"/>
+          <w:sz w:val="28"/>
+          <w:rtl/>
         </w:rPr>
       </w:pPr>
       <w:r>
@@ -6294,21 +6295,20 @@
     </w:p>
     <w:p>
       <w:pPr>
-        <w:rPr>
-          <w:rFonts w:asciiTheme="majorBidi" w:hAnsiTheme="majorBidi"/>
-          <w:sz w:val="28"/>
-        </w:rPr>
-      </w:pPr>
-      <w:r>
-        <w:rPr>
-          <w:rFonts w:asciiTheme="majorBidi" w:hAnsiTheme="majorBidi"/>
-          <w:sz w:val="28"/>
-        </w:rPr>
+        <w:pStyle w:val="2"/>
+        <w:numPr>
+          <w:ilvl w:val="0"/>
+          <w:numId w:val="0"/>
+        </w:numPr>
+        <w:spacing w:line="360" w:lineRule="auto"/>
+      </w:pPr>
+      <w:r>
         <w:t>1.3</w:t>
       </w:r>
       <w:r>
         <w:rPr>
-          <w:rFonts w:asciiTheme="majorBidi" w:hAnsiTheme="majorBidi"/>
+          <w:rFonts w:asciiTheme="majorBidi" w:eastAsiaTheme="minorHAnsi" w:hAnsiTheme="majorBidi"/>
+          <w:bCs w:val="0"/>
           <w:sz w:val="28"/>
           <w:rtl/>
         </w:rPr>
@@ -6316,7 +6316,8 @@
       </w:r>
       <w:r>
         <w:rPr>
-          <w:rFonts w:asciiTheme="majorBidi" w:hAnsiTheme="majorBidi"/>
+          <w:rFonts w:asciiTheme="majorBidi" w:eastAsiaTheme="minorHAnsi" w:hAnsiTheme="majorBidi"/>
+          <w:bCs w:val="0"/>
           <w:sz w:val="28"/>
         </w:rPr>
         <w:t>Project Problem</w:t>
@@ -6540,6 +6541,7 @@
     <w:p>
       <w:pPr>
         <w:pStyle w:val="2"/>
+        <w:ind w:left="-424"/>
         <w:jc w:val="both"/>
         <w:rPr>
           <w:sz w:val="32"/>
@@ -9070,6 +9072,7 @@
     <w:p>
       <w:pPr>
         <w:pStyle w:val="2"/>
+        <w:ind w:left="-424"/>
         <w:jc w:val="both"/>
         <w:rPr>
           <w:sz w:val="32"/>
@@ -12614,7 +12617,6 @@
           <w:sz w:val="28"/>
           <w:rtl/>
         </w:rPr>
-        <w:lastRenderedPageBreak/>
         <w:t xml:space="preserve"> </w:t>
       </w:r>
     </w:p>
@@ -12636,6 +12638,7 @@
           <w:sz w:val="28"/>
           <w:rtl/>
         </w:rPr>
+        <w:lastRenderedPageBreak/>
         <w:t>الوصول،</w:t>
       </w:r>
       <w:r>
@@ -13564,10 +13567,7 @@
     <w:p>
       <w:pPr>
         <w:pStyle w:val="2"/>
-        <w:jc w:val="both"/>
-        <w:rPr>
-          <w:sz w:val="32"/>
-          <w:szCs w:val="32"/>
+        <w:rPr>
           <w:rtl/>
         </w:rPr>
       </w:pPr>
@@ -13575,27 +13575,32 @@
       <w:r>
         <w:rPr>
           <w:rFonts w:hint="cs"/>
-          <w:sz w:val="32"/>
-          <w:szCs w:val="32"/>
-          <w:rtl/>
-        </w:rPr>
-        <w:t>مشكلة المشروع (</w:t>
+          <w:rtl/>
+        </w:rPr>
+        <w:t xml:space="preserve">مشكلة </w:t>
+      </w:r>
+      <w:r>
+        <w:rPr>
+          <w:rtl/>
+        </w:rPr>
+        <w:t>المشروع</w:t>
+      </w:r>
+      <w:r>
+        <w:rPr>
+          <w:rFonts w:hint="cs"/>
+          <w:rtl/>
+        </w:rPr>
+        <w:t xml:space="preserve"> (</w:t>
       </w:r>
       <w:r>
         <w:rPr>
           <w:rFonts w:asciiTheme="majorBidi" w:hAnsiTheme="majorBidi"/>
           <w:b/>
           <w:bCs w:val="0"/>
-          <w:sz w:val="32"/>
-          <w:szCs w:val="32"/>
         </w:rPr>
         <w:t>Project</w:t>
       </w:r>
       <w:r>
-        <w:rPr>
-          <w:sz w:val="32"/>
-          <w:szCs w:val="32"/>
-        </w:rPr>
         <w:t xml:space="preserve"> </w:t>
       </w:r>
       <w:r>
@@ -13603,16 +13608,12 @@
           <w:rFonts w:asciiTheme="majorBidi" w:hAnsiTheme="majorBidi"/>
           <w:b/>
           <w:bCs w:val="0"/>
-          <w:sz w:val="32"/>
-          <w:szCs w:val="32"/>
         </w:rPr>
         <w:t>Problem</w:t>
       </w:r>
       <w:r>
         <w:rPr>
           <w:rFonts w:hint="cs"/>
-          <w:sz w:val="32"/>
-          <w:szCs w:val="32"/>
           <w:rtl/>
         </w:rPr>
         <w:t>)</w:t>
@@ -18528,7 +18529,6 @@
           <w:rFonts w:cs="Times New Roman"/>
           <w:rtl/>
         </w:rPr>
-        <w:lastRenderedPageBreak/>
         <w:t xml:space="preserve"> </w:t>
       </w:r>
     </w:p>
@@ -18545,6 +18545,7 @@
           <w:rFonts w:cs="Times New Roman" w:hint="cs"/>
           <w:rtl/>
         </w:rPr>
+        <w:lastRenderedPageBreak/>
         <w:t>بعد</w:t>
       </w:r>
       <w:r>
@@ -22883,7 +22884,6 @@
           <w:szCs w:val="32"/>
           <w:rtl/>
         </w:rPr>
-        <w:lastRenderedPageBreak/>
         <w:t>أهمية المشروع (</w:t>
       </w:r>
       <w:r>
@@ -23400,6 +23400,7 @@
           <w:sz w:val="28"/>
           <w:rtl/>
         </w:rPr>
+        <w:lastRenderedPageBreak/>
         <w:t>تعزيز</w:t>
       </w:r>
       <w:r>
@@ -27397,16 +27398,7 @@
           <w:sz w:val="28"/>
           <w:rtl/>
         </w:rPr>
-        <w:t xml:space="preserve">، وهي أطر تنظّم عملية بناء الأنظمة وتساعد على ضبط التخطيط والتنفيذ. </w:t>
-      </w:r>
-      <w:r>
-        <w:rPr>
-          <w:rFonts w:asciiTheme="majorBidi" w:hAnsiTheme="majorBidi"/>
-          <w:sz w:val="28"/>
-          <w:rtl/>
-        </w:rPr>
-        <w:lastRenderedPageBreak/>
-        <w:t xml:space="preserve">وتتنوع هذه المنهجيات بحسب طبيعة المشروع، ومن </w:t>
+        <w:t xml:space="preserve">، وهي أطر تنظّم عملية بناء الأنظمة وتساعد على ضبط التخطيط والتنفيذ. وتتنوع هذه المنهجيات بحسب طبيعة المشروع، ومن </w:t>
       </w:r>
       <w:proofErr w:type="gramStart"/>
       <w:r>
@@ -27616,6 +27608,7 @@
           <w:sz w:val="28"/>
           <w:rtl/>
         </w:rPr>
+        <w:lastRenderedPageBreak/>
         <w:t xml:space="preserve">وبين هذه النماذج، وقع اختيارنا على منهجية </w:t>
       </w:r>
       <w:proofErr w:type="gramStart"/>
@@ -27847,7 +27840,7 @@
           <w:lang w:val="ar-SA"/>
         </w:rPr>
         <w:drawing>
-          <wp:inline distT="0" distB="0" distL="0" distR="0" wp14:anchorId="544E6ED6" wp14:editId="2A494D58">
+          <wp:inline distT="0" distB="0" distL="0" distR="0" wp14:anchorId="544E6ED6" wp14:editId="4651303D">
             <wp:extent cx="5731510" cy="4109720"/>
             <wp:effectExtent l="0" t="0" r="2540" b="5080"/>
             <wp:docPr id="1" name="Picture 1"/>
@@ -31894,7 +31887,6 @@
           <w:rFonts w:asciiTheme="majorBidi" w:hAnsiTheme="majorBidi"/>
           <w:sz w:val="28"/>
         </w:rPr>
-        <w:lastRenderedPageBreak/>
         <w:t xml:space="preserve"> </w:t>
       </w:r>
       <w:r>
@@ -32071,6 +32063,7 @@
           <w:sz w:val="28"/>
           <w:rtl/>
         </w:rPr>
+        <w:lastRenderedPageBreak/>
         <w:t>وصولا</w:t>
       </w:r>
       <w:r>
@@ -32434,7 +32427,6 @@
     <w:p>
       <w:pPr>
         <w:rPr>
-          <w:rFonts w:hint="cs"/>
           <w:rtl/>
         </w:rPr>
       </w:pPr>
@@ -32765,7 +32757,7 @@
           <w:rtl/>
         </w:rPr>
         <w:lastRenderedPageBreak/>
-        <w:t xml:space="preserve">الفصل الثاني: الإطار النظري والدراسات السابقة </w:t>
+        <w:t>الفصل الثاني: الإطار النظري والدراسات السابقة</w:t>
       </w:r>
     </w:p>
     <w:p>
@@ -32781,15 +32773,16 @@
           <w:rFonts w:hint="cs"/>
           <w:rtl/>
         </w:rPr>
-        <w:t>المقدمة (</w:t>
-      </w:r>
-      <w:r>
-        <w:rPr>
-          <w:rFonts w:asciiTheme="majorBidi" w:hAnsiTheme="majorBidi"/>
-          <w:b/>
-          <w:bCs w:val="0"/>
-          <w:sz w:val="28"/>
-        </w:rPr>
+        <w:t>المقدمة</w:t>
+      </w:r>
+      <w:r>
+        <w:rPr>
+          <w:rFonts w:hint="cs"/>
+          <w:rtl/>
+        </w:rPr>
+        <w:t xml:space="preserve"> (</w:t>
+      </w:r>
+      <w:r>
         <w:t>Introduction</w:t>
       </w:r>
       <w:r>
@@ -33013,7 +33006,7 @@
       <w:pPr>
         <w:jc w:val="both"/>
         <w:rPr>
-          <w:rFonts w:asciiTheme="majorBidi" w:hAnsiTheme="majorBidi" w:hint="cs"/>
+          <w:rFonts w:asciiTheme="majorBidi" w:hAnsiTheme="majorBidi"/>
           <w:sz w:val="28"/>
           <w:rtl/>
         </w:rPr>
@@ -33083,7 +33076,6 @@
         <w:rPr>
           <w:rFonts w:asciiTheme="majorBidi" w:hAnsiTheme="majorBidi"/>
           <w:b/>
-          <w:bCs w:val="0"/>
           <w:sz w:val="28"/>
         </w:rPr>
         <w:t>Pervious</w:t>
@@ -33099,7 +33091,6 @@
         <w:rPr>
           <w:rFonts w:asciiTheme="majorBidi" w:hAnsiTheme="majorBidi"/>
           <w:b/>
-          <w:bCs w:val="0"/>
           <w:sz w:val="28"/>
         </w:rPr>
         <w:t>Studies</w:t>
@@ -33158,7 +33149,7 @@
           <w:sz w:val="28"/>
           <w:rtl/>
         </w:rPr>
-        <w:t>2</w:t>
+        <w:t xml:space="preserve">2  </w:t>
       </w:r>
       <w:r>
         <w:rPr>
@@ -33168,7 +33159,18 @@
           <w:sz w:val="28"/>
           <w:rtl/>
         </w:rPr>
-        <w:t xml:space="preserve">  </w:t>
+        <w:t>منصة</w:t>
+      </w:r>
+      <w:proofErr w:type="gramEnd"/>
+      <w:r>
+        <w:rPr>
+          <w:rFonts w:asciiTheme="majorBidi" w:hAnsiTheme="majorBidi"/>
+          <w:b/>
+          <w:bCs/>
+          <w:sz w:val="28"/>
+          <w:rtl/>
+        </w:rPr>
+        <w:t xml:space="preserve"> </w:t>
       </w:r>
       <w:r>
         <w:rPr>
@@ -33178,9 +33180,8 @@
           <w:sz w:val="28"/>
           <w:rtl/>
         </w:rPr>
-        <w:t>منصة</w:t>
-      </w:r>
-      <w:proofErr w:type="gramEnd"/>
+        <w:t>صحتي</w:t>
+      </w:r>
       <w:r>
         <w:rPr>
           <w:rFonts w:asciiTheme="majorBidi" w:hAnsiTheme="majorBidi"/>
@@ -33189,7 +33190,28 @@
           <w:sz w:val="28"/>
           <w:rtl/>
         </w:rPr>
-        <w:t xml:space="preserve"> </w:t>
+        <w:t xml:space="preserve"> (</w:t>
+      </w:r>
+      <w:proofErr w:type="spellStart"/>
+      <w:r>
+        <w:rPr>
+          <w:rFonts w:asciiTheme="majorBidi" w:hAnsiTheme="majorBidi"/>
+          <w:b/>
+          <w:bCs/>
+          <w:sz w:val="28"/>
+        </w:rPr>
+        <w:t>Sehhaty</w:t>
+      </w:r>
+      <w:proofErr w:type="spellEnd"/>
+      <w:r>
+        <w:rPr>
+          <w:rFonts w:asciiTheme="majorBidi" w:hAnsiTheme="majorBidi"/>
+          <w:b/>
+          <w:bCs/>
+          <w:sz w:val="28"/>
+          <w:rtl/>
+        </w:rPr>
+        <w:t xml:space="preserve">) – </w:t>
       </w:r>
       <w:r>
         <w:rPr>
@@ -33199,7 +33221,7 @@
           <w:sz w:val="28"/>
           <w:rtl/>
         </w:rPr>
-        <w:t>صحتي</w:t>
+        <w:t>المملكة</w:t>
       </w:r>
       <w:r>
         <w:rPr>
@@ -33209,28 +33231,27 @@
           <w:sz w:val="28"/>
           <w:rtl/>
         </w:rPr>
-        <w:t xml:space="preserve"> (</w:t>
-      </w:r>
-      <w:proofErr w:type="spellStart"/>
+        <w:t xml:space="preserve"> </w:t>
+      </w:r>
+      <w:r>
+        <w:rPr>
+          <w:rFonts w:asciiTheme="majorBidi" w:hAnsiTheme="majorBidi" w:hint="cs"/>
+          <w:b/>
+          <w:bCs/>
+          <w:sz w:val="28"/>
+          <w:rtl/>
+        </w:rPr>
+        <w:t>العربية</w:t>
+      </w:r>
       <w:r>
         <w:rPr>
           <w:rFonts w:asciiTheme="majorBidi" w:hAnsiTheme="majorBidi"/>
           <w:b/>
           <w:bCs/>
           <w:sz w:val="28"/>
-        </w:rPr>
-        <w:t>Sehhaty</w:t>
-      </w:r>
-      <w:proofErr w:type="spellEnd"/>
-      <w:r>
-        <w:rPr>
-          <w:rFonts w:asciiTheme="majorBidi" w:hAnsiTheme="majorBidi"/>
-          <w:b/>
-          <w:bCs/>
-          <w:sz w:val="28"/>
-          <w:rtl/>
-        </w:rPr>
-        <w:t xml:space="preserve">) – </w:t>
+          <w:rtl/>
+        </w:rPr>
+        <w:t xml:space="preserve"> </w:t>
       </w:r>
       <w:r>
         <w:rPr>
@@ -33240,57 +33261,7 @@
           <w:sz w:val="28"/>
           <w:rtl/>
         </w:rPr>
-        <w:t>المملكة</w:t>
-      </w:r>
-      <w:r>
-        <w:rPr>
-          <w:rFonts w:asciiTheme="majorBidi" w:hAnsiTheme="majorBidi"/>
-          <w:b/>
-          <w:bCs/>
-          <w:sz w:val="28"/>
-          <w:rtl/>
-        </w:rPr>
-        <w:t xml:space="preserve"> </w:t>
-      </w:r>
-      <w:r>
-        <w:rPr>
-          <w:rFonts w:asciiTheme="majorBidi" w:hAnsiTheme="majorBidi" w:hint="cs"/>
-          <w:b/>
-          <w:bCs/>
-          <w:sz w:val="28"/>
-          <w:rtl/>
-        </w:rPr>
-        <w:t>العربية</w:t>
-      </w:r>
-      <w:r>
-        <w:rPr>
-          <w:rFonts w:asciiTheme="majorBidi" w:hAnsiTheme="majorBidi"/>
-          <w:b/>
-          <w:bCs/>
-          <w:sz w:val="28"/>
-          <w:rtl/>
-        </w:rPr>
-        <w:t xml:space="preserve"> </w:t>
-      </w:r>
-      <w:r>
-        <w:rPr>
-          <w:rFonts w:asciiTheme="majorBidi" w:hAnsiTheme="majorBidi" w:hint="cs"/>
-          <w:b/>
-          <w:bCs/>
-          <w:sz w:val="28"/>
-          <w:rtl/>
-        </w:rPr>
-        <w:t>السعودية</w:t>
-      </w:r>
-      <w:r>
-        <w:rPr>
-          <w:rFonts w:asciiTheme="majorBidi" w:hAnsiTheme="majorBidi" w:hint="cs"/>
-          <w:b/>
-          <w:bCs/>
-          <w:sz w:val="28"/>
-          <w:rtl/>
-        </w:rPr>
-        <w:t>:</w:t>
+        <w:t>السعودية:</w:t>
       </w:r>
     </w:p>
     <w:p>
@@ -33332,15 +33303,7 @@
           <w:sz w:val="28"/>
           <w:rtl/>
         </w:rPr>
-        <w:t xml:space="preserve"> </w:t>
-      </w:r>
-      <w:r>
-        <w:rPr>
-          <w:rFonts w:asciiTheme="majorBidi" w:hAnsiTheme="majorBidi" w:cstheme="majorBidi" w:hint="cs"/>
-          <w:sz w:val="28"/>
-          <w:rtl/>
-        </w:rPr>
-        <w:t>تُعد</w:t>
+        <w:t xml:space="preserve"> تُعد</w:t>
       </w:r>
       <w:r>
         <w:rPr>
@@ -34806,16 +34769,7 @@
           <w:bCs/>
           <w:sz w:val="28"/>
         </w:rPr>
-        <w:t>.2.</w:t>
-      </w:r>
-      <w:r>
-        <w:rPr>
-          <w:rFonts w:asciiTheme="majorBidi" w:hAnsiTheme="majorBidi"/>
-          <w:b/>
-          <w:bCs/>
-          <w:sz w:val="28"/>
-        </w:rPr>
-        <w:t xml:space="preserve">2     </w:t>
+        <w:t xml:space="preserve">.2.2     </w:t>
       </w:r>
       <w:proofErr w:type="gramStart"/>
       <w:r>
@@ -35281,7 +35235,7 @@
           <w:bCs/>
           <w:sz w:val="28"/>
         </w:rPr>
-        <w:t>1</w:t>
+        <w:t>3</w:t>
       </w:r>
       <w:r>
         <w:rPr>
@@ -35405,7 +35359,7 @@
     <w:p>
       <w:pPr>
         <w:rPr>
-          <w:rFonts w:asciiTheme="majorBidi" w:hAnsiTheme="majorBidi" w:hint="cs"/>
+          <w:rFonts w:asciiTheme="majorBidi" w:hAnsiTheme="majorBidi"/>
           <w:sz w:val="28"/>
           <w:rtl/>
         </w:rPr>
@@ -35845,11 +35799,7 @@
     </w:p>
     <w:p>
       <w:pPr>
-        <w:pStyle w:val="2"/>
-        <w:numPr>
-          <w:ilvl w:val="0"/>
-          <w:numId w:val="3"/>
-        </w:numPr>
+        <w:pStyle w:val="3"/>
         <w:rPr>
           <w:rtl/>
         </w:rPr>
@@ -36357,16 +36307,7 @@
           <w:sz w:val="28"/>
           <w:rtl/>
         </w:rPr>
-        <w:t xml:space="preserve">وقدرتها </w:t>
-      </w:r>
-      <w:r>
-        <w:rPr>
-          <w:rFonts w:asciiTheme="majorBidi" w:hAnsiTheme="majorBidi"/>
-          <w:sz w:val="28"/>
-          <w:rtl/>
-        </w:rPr>
-        <w:lastRenderedPageBreak/>
-        <w:t>على معالجة الطلبات بشكل غير متزامن</w:t>
+        <w:t>وقدرتها على معالجة الطلبات بشكل غير متزامن</w:t>
       </w:r>
       <w:r>
         <w:rPr>
@@ -36439,6 +36380,7 @@
           <w:rFonts w:asciiTheme="majorBidi" w:hAnsiTheme="majorBidi"/>
           <w:sz w:val="28"/>
         </w:rPr>
+        <w:lastRenderedPageBreak/>
         <w:t xml:space="preserve"> </w:t>
       </w:r>
       <w:r>
@@ -36570,181 +36512,6 @@
           <w:rtl/>
         </w:rPr>
         <w:t xml:space="preserve"> </w:t>
-      </w:r>
-    </w:p>
-    <w:p>
-      <w:pPr>
-        <w:pStyle w:val="a9"/>
-        <w:spacing w:after="0"/>
-        <w:rPr>
-          <w:rFonts w:asciiTheme="majorBidi" w:hAnsiTheme="majorBidi" w:cstheme="majorBidi"/>
-          <w:b/>
-          <w:sz w:val="28"/>
-        </w:rPr>
-      </w:pPr>
-      <w:r>
-        <w:rPr>
-          <w:rFonts w:asciiTheme="majorBidi" w:hAnsiTheme="majorBidi" w:cstheme="majorBidi"/>
-          <w:b/>
-          <w:bCs/>
-          <w:sz w:val="28"/>
-        </w:rPr>
-        <w:t>Prisma (ORM</w:t>
-      </w:r>
-      <w:proofErr w:type="gramStart"/>
-      <w:r>
-        <w:rPr>
-          <w:rFonts w:asciiTheme="majorBidi" w:hAnsiTheme="majorBidi" w:cstheme="majorBidi"/>
-          <w:b/>
-          <w:bCs/>
-          <w:sz w:val="28"/>
-        </w:rPr>
-        <w:t>)</w:t>
-      </w:r>
-      <w:r>
-        <w:rPr>
-          <w:rFonts w:asciiTheme="majorBidi" w:hAnsiTheme="majorBidi" w:cstheme="majorBidi"/>
-          <w:b/>
-          <w:sz w:val="28"/>
-          <w:rtl/>
-        </w:rPr>
-        <w:t xml:space="preserve"> :</w:t>
-      </w:r>
-      <w:proofErr w:type="gramEnd"/>
-    </w:p>
-    <w:p>
-      <w:pPr>
-        <w:spacing w:after="0"/>
-        <w:jc w:val="both"/>
-        <w:rPr>
-          <w:rFonts w:asciiTheme="majorBidi" w:hAnsiTheme="majorBidi"/>
-          <w:b/>
-          <w:bCs/>
-          <w:sz w:val="28"/>
-          <w:rtl/>
-        </w:rPr>
-      </w:pPr>
-      <w:r>
-        <w:rPr>
-          <w:rFonts w:asciiTheme="majorBidi" w:hAnsiTheme="majorBidi"/>
-          <w:sz w:val="28"/>
-          <w:rtl/>
-        </w:rPr>
-        <w:t xml:space="preserve">              </w:t>
-      </w:r>
-      <w:r>
-        <w:rPr>
-          <w:rFonts w:asciiTheme="majorBidi" w:hAnsiTheme="majorBidi"/>
-          <w:sz w:val="28"/>
-          <w:rtl/>
-        </w:rPr>
-        <w:t xml:space="preserve">أداة حديثة لرسم الخرائط الكائنية </w:t>
-      </w:r>
-      <w:r>
-        <w:rPr>
-          <w:rFonts w:asciiTheme="majorBidi" w:hAnsiTheme="majorBidi" w:hint="cs"/>
-          <w:sz w:val="28"/>
-          <w:rtl/>
-        </w:rPr>
-        <w:t>العلائقية</w:t>
-      </w:r>
-      <w:r>
-        <w:rPr>
-          <w:rFonts w:asciiTheme="majorBidi" w:hAnsiTheme="majorBidi"/>
-          <w:sz w:val="28"/>
-        </w:rPr>
-        <w:t xml:space="preserve"> (ORM) </w:t>
-      </w:r>
-      <w:r>
-        <w:rPr>
-          <w:rFonts w:asciiTheme="majorBidi" w:hAnsiTheme="majorBidi"/>
-          <w:sz w:val="28"/>
-          <w:rtl/>
-        </w:rPr>
-        <w:t>تستخدم للتعامل مع قواعد البيانات في بيئة</w:t>
-      </w:r>
-      <w:r>
-        <w:rPr>
-          <w:rFonts w:asciiTheme="majorBidi" w:hAnsiTheme="majorBidi"/>
-          <w:sz w:val="28"/>
-        </w:rPr>
-        <w:t xml:space="preserve"> Node.js. </w:t>
-      </w:r>
-      <w:r>
-        <w:rPr>
-          <w:rFonts w:asciiTheme="majorBidi" w:hAnsiTheme="majorBidi" w:hint="cs"/>
-          <w:sz w:val="28"/>
-          <w:rtl/>
-        </w:rPr>
-        <w:t xml:space="preserve"> </w:t>
-      </w:r>
-      <w:r>
-        <w:rPr>
-          <w:rFonts w:asciiTheme="majorBidi" w:hAnsiTheme="majorBidi"/>
-          <w:sz w:val="28"/>
-          <w:rtl/>
-        </w:rPr>
-        <w:t>تُسهّل</w:t>
-      </w:r>
-      <w:r>
-        <w:rPr>
-          <w:rFonts w:asciiTheme="majorBidi" w:hAnsiTheme="majorBidi"/>
-          <w:sz w:val="28"/>
-        </w:rPr>
-        <w:t xml:space="preserve"> Prisma </w:t>
-      </w:r>
-      <w:r>
-        <w:rPr>
-          <w:rFonts w:asciiTheme="majorBidi" w:hAnsiTheme="majorBidi"/>
-          <w:sz w:val="28"/>
-          <w:rtl/>
-        </w:rPr>
-        <w:t>عملية كتابة الاستعلامات وإدارة مخطط قاعدة البيانات</w:t>
-      </w:r>
-      <w:r>
-        <w:rPr>
-          <w:rFonts w:asciiTheme="majorBidi" w:hAnsiTheme="majorBidi"/>
-          <w:sz w:val="28"/>
-        </w:rPr>
-        <w:t xml:space="preserve"> (Schema) </w:t>
-      </w:r>
-      <w:r>
-        <w:rPr>
-          <w:rFonts w:asciiTheme="majorBidi" w:hAnsiTheme="majorBidi"/>
-          <w:sz w:val="28"/>
-          <w:rtl/>
-        </w:rPr>
-        <w:t>من خلال توفير واجهة برمجية آمنة</w:t>
-      </w:r>
-      <w:r>
-        <w:rPr>
-          <w:rFonts w:asciiTheme="majorBidi" w:hAnsiTheme="majorBidi"/>
-          <w:sz w:val="28"/>
-        </w:rPr>
-        <w:t xml:space="preserve"> (Type-safe) </w:t>
-      </w:r>
-      <w:r>
-        <w:rPr>
-          <w:rFonts w:asciiTheme="majorBidi" w:hAnsiTheme="majorBidi"/>
-          <w:sz w:val="28"/>
-          <w:rtl/>
-        </w:rPr>
-        <w:t>تضمن دقة البيانات وسرعة التطوير عند التعامل مع سجلات المرضى والأطباء</w:t>
-      </w:r>
-      <w:r>
-        <w:rPr>
-          <w:rFonts w:asciiTheme="majorBidi" w:hAnsiTheme="majorBidi"/>
-          <w:sz w:val="28"/>
-        </w:rPr>
-        <w:t>.</w:t>
-      </w:r>
-      <w:r>
-        <w:rPr>
-          <w:rFonts w:asciiTheme="majorBidi" w:hAnsiTheme="majorBidi"/>
-          <w:sz w:val="28"/>
-          <w:rtl/>
-        </w:rPr>
-        <w:t xml:space="preserve">  </w:t>
       </w:r>
     </w:p>
     <w:p>
@@ -36756,31 +36523,49 @@
         </w:numPr>
         <w:spacing w:after="0"/>
         <w:rPr>
-          <w:rFonts w:asciiTheme="majorBidi" w:hAnsiTheme="majorBidi" w:cstheme="majorBidi"/>
+          <w:rFonts w:asciiTheme="majorBidi" w:hAnsiTheme="majorBidi"/>
           <w:b/>
           <w:sz w:val="28"/>
         </w:rPr>
       </w:pPr>
       <w:r>
         <w:rPr>
-          <w:rFonts w:asciiTheme="majorBidi" w:hAnsiTheme="majorBidi" w:cstheme="majorBidi"/>
+          <w:rFonts w:asciiTheme="majorBidi" w:hAnsiTheme="majorBidi"/>
           <w:b/>
-          <w:sz w:val="28"/>
-        </w:rPr>
-        <w:t xml:space="preserve">MariaDB </w:t>
+          <w:bCs/>
+          <w:sz w:val="28"/>
+        </w:rPr>
+        <w:t>Prisma (</w:t>
       </w:r>
       <w:proofErr w:type="gramStart"/>
       <w:r>
         <w:rPr>
-          <w:rFonts w:asciiTheme="majorBidi" w:hAnsiTheme="majorBidi" w:cstheme="majorBidi"/>
+          <w:rFonts w:asciiTheme="majorBidi" w:hAnsiTheme="majorBidi"/>
           <w:b/>
-          <w:sz w:val="28"/>
-        </w:rPr>
-        <w:t>Server</w:t>
-      </w:r>
-      <w:r>
-        <w:rPr>
-          <w:rFonts w:asciiTheme="majorBidi" w:hAnsiTheme="majorBidi" w:cstheme="majorBidi" w:hint="cs"/>
+          <w:bCs/>
+          <w:sz w:val="28"/>
+        </w:rPr>
+        <w:t>ORM</w:t>
+      </w:r>
+      <w:r>
+        <w:rPr>
+          <w:rFonts w:asciiTheme="majorBidi" w:hAnsiTheme="majorBidi"/>
+          <w:b/>
+          <w:sz w:val="28"/>
+        </w:rPr>
+        <w:t>)</w:t>
+      </w:r>
+      <w:r>
+        <w:rPr>
+          <w:rFonts w:asciiTheme="majorBidi" w:hAnsiTheme="majorBidi"/>
+          <w:b/>
+          <w:sz w:val="28"/>
+        </w:rPr>
+        <w:t xml:space="preserve"> </w:t>
+      </w:r>
+      <w:r>
+        <w:rPr>
+          <w:rFonts w:asciiTheme="majorBidi" w:hAnsiTheme="majorBidi"/>
           <w:b/>
           <w:sz w:val="28"/>
           <w:rtl/>
@@ -36791,9 +36576,12 @@
     </w:p>
     <w:p>
       <w:pPr>
+        <w:spacing w:after="0"/>
         <w:jc w:val="both"/>
         <w:rPr>
           <w:rFonts w:asciiTheme="majorBidi" w:hAnsiTheme="majorBidi"/>
+          <w:b/>
+          <w:bCs/>
           <w:sz w:val="28"/>
           <w:rtl/>
         </w:rPr>
@@ -36804,22 +36592,30 @@
           <w:sz w:val="28"/>
           <w:rtl/>
         </w:rPr>
-        <w:t xml:space="preserve">            </w:t>
+        <w:t xml:space="preserve">              </w:t>
       </w:r>
       <w:r>
         <w:rPr>
           <w:rFonts w:asciiTheme="majorBidi" w:hAnsiTheme="majorBidi"/>
           <w:sz w:val="28"/>
-        </w:rPr>
-        <w:t> </w:t>
+          <w:rtl/>
+        </w:rPr>
+        <w:t xml:space="preserve">أداة حديثة لرسم الخرائط الكائنية </w:t>
+      </w:r>
+      <w:r>
+        <w:rPr>
+          <w:rFonts w:asciiTheme="majorBidi" w:hAnsiTheme="majorBidi" w:hint="cs"/>
+          <w:sz w:val="28"/>
+          <w:rtl/>
+        </w:rPr>
+        <w:t>العلائقية</w:t>
       </w:r>
       <w:r>
         <w:rPr>
           <w:rFonts w:asciiTheme="majorBidi" w:hAnsiTheme="majorBidi"/>
           <w:sz w:val="28"/>
-          <w:rtl/>
-        </w:rPr>
-        <w:t>نظام إدارة قواعد بيانات علائقية مفتوح المصدر ومستقر للغاية. يُستخدم في هذا المشروع لتخزين كافة البيانات الحساسة مثل معلومات المستخدمين، المواعيد الطبية، وسجلات التتبع الصحي، مع ضمان سرعة استرجاع البيانات وحمايتها من خلال تقنيات التخزين المتقدمة</w:t>
+        </w:rPr>
+        <w:t xml:space="preserve"> (ORM) </w:t>
       </w:r>
       <w:r>
         <w:rPr>
@@ -36827,7 +36623,90 @@
           <w:sz w:val="28"/>
           <w:rtl/>
         </w:rPr>
+        <w:t>تستخدم للتعامل مع قواعد البيانات في بيئة</w:t>
+      </w:r>
+      <w:r>
+        <w:rPr>
+          <w:rFonts w:asciiTheme="majorBidi" w:hAnsiTheme="majorBidi"/>
+          <w:sz w:val="28"/>
+        </w:rPr>
+        <w:t xml:space="preserve"> Node.js. </w:t>
+      </w:r>
+      <w:r>
+        <w:rPr>
+          <w:rFonts w:asciiTheme="majorBidi" w:hAnsiTheme="majorBidi" w:hint="cs"/>
+          <w:sz w:val="28"/>
+          <w:rtl/>
+        </w:rPr>
+        <w:t xml:space="preserve"> </w:t>
+      </w:r>
+      <w:r>
+        <w:rPr>
+          <w:rFonts w:asciiTheme="majorBidi" w:hAnsiTheme="majorBidi"/>
+          <w:sz w:val="28"/>
+          <w:rtl/>
+        </w:rPr>
+        <w:t>تُسهّل</w:t>
+      </w:r>
+      <w:r>
+        <w:rPr>
+          <w:rFonts w:asciiTheme="majorBidi" w:hAnsiTheme="majorBidi"/>
+          <w:sz w:val="28"/>
+        </w:rPr>
+        <w:t xml:space="preserve"> Prisma </w:t>
+      </w:r>
+      <w:r>
+        <w:rPr>
+          <w:rFonts w:asciiTheme="majorBidi" w:hAnsiTheme="majorBidi"/>
+          <w:sz w:val="28"/>
+          <w:rtl/>
+        </w:rPr>
+        <w:t>عملية كتابة الاستعلامات وإدارة مخطط قاعدة البيانات</w:t>
+      </w:r>
+      <w:r>
+        <w:rPr>
+          <w:rFonts w:asciiTheme="majorBidi" w:hAnsiTheme="majorBidi"/>
+          <w:sz w:val="28"/>
+        </w:rPr>
+        <w:t xml:space="preserve"> (Schema) </w:t>
+      </w:r>
+      <w:r>
+        <w:rPr>
+          <w:rFonts w:asciiTheme="majorBidi" w:hAnsiTheme="majorBidi"/>
+          <w:sz w:val="28"/>
+          <w:rtl/>
+        </w:rPr>
+        <w:t>من خلال توفير واجهة برمجية آمنة</w:t>
+      </w:r>
+      <w:r>
+        <w:rPr>
+          <w:rFonts w:asciiTheme="majorBidi" w:hAnsiTheme="majorBidi"/>
+          <w:sz w:val="28"/>
+        </w:rPr>
+        <w:t xml:space="preserve"> (Type-safe) </w:t>
+      </w:r>
+      <w:r>
+        <w:rPr>
+          <w:rFonts w:asciiTheme="majorBidi" w:hAnsiTheme="majorBidi"/>
+          <w:sz w:val="28"/>
+          <w:rtl/>
+        </w:rPr>
+        <w:t>تضمن دقة البيانات وسرعة التطوير عند التعامل مع سجلات المرضى والأطباء</w:t>
+      </w:r>
+      <w:r>
+        <w:rPr>
+          <w:rFonts w:asciiTheme="majorBidi" w:hAnsiTheme="majorBidi"/>
+          <w:sz w:val="28"/>
+        </w:rPr>
         <w:t>.</w:t>
+      </w:r>
+      <w:r>
+        <w:rPr>
+          <w:rFonts w:asciiTheme="majorBidi" w:hAnsiTheme="majorBidi"/>
+          <w:sz w:val="28"/>
+          <w:rtl/>
+        </w:rPr>
+        <w:t xml:space="preserve">  </w:t>
       </w:r>
     </w:p>
     <w:p>
@@ -36839,33 +36718,31 @@
         </w:numPr>
         <w:spacing w:after="0"/>
         <w:rPr>
-          <w:rFonts w:asciiTheme="majorBidi" w:hAnsiTheme="majorBidi" w:cstheme="majorBidi"/>
+          <w:rFonts w:asciiTheme="majorBidi" w:hAnsiTheme="majorBidi"/>
           <w:b/>
           <w:sz w:val="28"/>
         </w:rPr>
       </w:pPr>
       <w:r>
         <w:rPr>
-          <w:rFonts w:asciiTheme="majorBidi" w:hAnsiTheme="majorBidi" w:cstheme="majorBidi"/>
+          <w:rFonts w:asciiTheme="majorBidi" w:hAnsiTheme="majorBidi"/>
           <w:b/>
-          <w:bCs/>
-          <w:sz w:val="28"/>
-        </w:rPr>
-        <w:t>HTML</w:t>
+          <w:sz w:val="28"/>
+        </w:rPr>
+        <w:t xml:space="preserve">MariaDB </w:t>
       </w:r>
       <w:proofErr w:type="gramStart"/>
       <w:r>
         <w:rPr>
-          <w:rFonts w:asciiTheme="majorBidi" w:hAnsiTheme="majorBidi" w:cstheme="majorBidi"/>
+          <w:rFonts w:asciiTheme="majorBidi" w:hAnsiTheme="majorBidi"/>
           <w:b/>
-          <w:bCs/>
-          <w:sz w:val="28"/>
-        </w:rPr>
-        <w:t>5</w:t>
-      </w:r>
-      <w:r>
-        <w:rPr>
-          <w:rFonts w:asciiTheme="majorBidi" w:hAnsiTheme="majorBidi" w:cstheme="majorBidi" w:hint="cs"/>
+          <w:sz w:val="28"/>
+        </w:rPr>
+        <w:t>Server</w:t>
+      </w:r>
+      <w:r>
+        <w:rPr>
+          <w:rFonts w:asciiTheme="majorBidi" w:hAnsiTheme="majorBidi" w:hint="cs"/>
           <w:b/>
           <w:sz w:val="28"/>
           <w:rtl/>
@@ -36876,153 +36753,39 @@
     </w:p>
     <w:p>
       <w:pPr>
-        <w:pStyle w:val="a9"/>
-        <w:spacing w:after="0"/>
         <w:jc w:val="both"/>
         <w:rPr>
-          <w:rFonts w:asciiTheme="majorBidi" w:hAnsiTheme="majorBidi" w:cstheme="majorBidi"/>
-          <w:b/>
-          <w:sz w:val="28"/>
-        </w:rPr>
-      </w:pPr>
-      <w:r>
-        <w:rPr>
-          <w:rFonts w:asciiTheme="majorBidi" w:hAnsiTheme="majorBidi" w:cstheme="majorBidi" w:hint="cs"/>
-          <w:b/>
-          <w:sz w:val="28"/>
-          <w:rtl/>
-        </w:rPr>
-        <w:t xml:space="preserve">   </w:t>
-      </w:r>
-      <w:r>
-        <w:rPr>
-          <w:rFonts w:asciiTheme="majorBidi" w:hAnsiTheme="majorBidi" w:cstheme="majorBidi" w:hint="cs"/>
-          <w:b/>
-          <w:sz w:val="28"/>
-          <w:rtl/>
-        </w:rPr>
-        <w:t xml:space="preserve"> </w:t>
-      </w:r>
-      <w:r>
-        <w:rPr>
-          <w:rFonts w:asciiTheme="majorBidi" w:hAnsiTheme="majorBidi" w:cstheme="majorBidi" w:hint="cs"/>
-          <w:b/>
-          <w:sz w:val="28"/>
-          <w:rtl/>
-        </w:rPr>
-        <w:t xml:space="preserve">   </w:t>
-      </w:r>
-      <w:r>
-        <w:rPr>
-          <w:rFonts w:asciiTheme="majorBidi" w:hAnsiTheme="majorBidi" w:cstheme="majorBidi"/>
-          <w:b/>
-          <w:sz w:val="28"/>
-          <w:rtl/>
-        </w:rPr>
-        <w:t>لغة التوصيف الأساسية التي تُشكل الهيكل الإنشائي لصفحات المنصة الطبية. تدعم</w:t>
-      </w:r>
-      <w:r>
-        <w:rPr>
-          <w:rFonts w:asciiTheme="majorBidi" w:hAnsiTheme="majorBidi" w:cstheme="majorBidi"/>
-          <w:b/>
-          <w:sz w:val="28"/>
-        </w:rPr>
-        <w:t xml:space="preserve"> HTML</w:t>
-      </w:r>
-      <w:proofErr w:type="gramStart"/>
-      <w:r>
-        <w:rPr>
-          <w:rFonts w:asciiTheme="majorBidi" w:hAnsiTheme="majorBidi" w:cstheme="majorBidi"/>
-          <w:b/>
-          <w:sz w:val="28"/>
-        </w:rPr>
-        <w:t xml:space="preserve">5 </w:t>
-      </w:r>
-      <w:r>
-        <w:rPr>
-          <w:rFonts w:asciiTheme="majorBidi" w:hAnsiTheme="majorBidi" w:cstheme="majorBidi" w:hint="cs"/>
-          <w:b/>
-          <w:sz w:val="28"/>
-          <w:rtl/>
-        </w:rPr>
-        <w:t xml:space="preserve"> </w:t>
-      </w:r>
-      <w:r>
-        <w:rPr>
-          <w:rFonts w:asciiTheme="majorBidi" w:hAnsiTheme="majorBidi" w:cstheme="majorBidi"/>
-          <w:b/>
-          <w:sz w:val="28"/>
-          <w:rtl/>
-        </w:rPr>
-        <w:t>الميزات</w:t>
-      </w:r>
-      <w:proofErr w:type="gramEnd"/>
-      <w:r>
-        <w:rPr>
-          <w:rFonts w:asciiTheme="majorBidi" w:hAnsiTheme="majorBidi" w:cstheme="majorBidi"/>
-          <w:b/>
-          <w:sz w:val="28"/>
-          <w:rtl/>
-        </w:rPr>
-        <w:t xml:space="preserve"> الحديثة مثل الوسائط المتعددة (فيديوهات المقالات الطبية) والعناصر الدلالية</w:t>
-      </w:r>
-      <w:r>
-        <w:rPr>
-          <w:rFonts w:asciiTheme="majorBidi" w:hAnsiTheme="majorBidi" w:cstheme="majorBidi"/>
-          <w:b/>
-          <w:sz w:val="28"/>
-        </w:rPr>
-        <w:t xml:space="preserve"> (Semantic </w:t>
-      </w:r>
-      <w:proofErr w:type="gramStart"/>
-      <w:r>
-        <w:rPr>
-          <w:rFonts w:asciiTheme="majorBidi" w:hAnsiTheme="majorBidi" w:cstheme="majorBidi"/>
-          <w:b/>
-          <w:sz w:val="28"/>
-        </w:rPr>
-        <w:t xml:space="preserve">Tags) </w:t>
-      </w:r>
-      <w:r>
-        <w:rPr>
-          <w:rFonts w:asciiTheme="majorBidi" w:hAnsiTheme="majorBidi" w:cstheme="majorBidi" w:hint="cs"/>
-          <w:b/>
-          <w:sz w:val="28"/>
-          <w:rtl/>
-        </w:rPr>
-        <w:t xml:space="preserve"> </w:t>
-      </w:r>
-      <w:r>
-        <w:rPr>
-          <w:rFonts w:asciiTheme="majorBidi" w:hAnsiTheme="majorBidi" w:cstheme="majorBidi"/>
-          <w:b/>
-          <w:sz w:val="28"/>
-          <w:rtl/>
-        </w:rPr>
-        <w:t>التي</w:t>
-      </w:r>
-      <w:proofErr w:type="gramEnd"/>
-      <w:r>
-        <w:rPr>
-          <w:rFonts w:asciiTheme="majorBidi" w:hAnsiTheme="majorBidi" w:cstheme="majorBidi"/>
-          <w:b/>
-          <w:sz w:val="28"/>
-          <w:rtl/>
-        </w:rPr>
-        <w:t xml:space="preserve"> تحسن من تجربة المستخدم وأداء محركات البحث</w:t>
-      </w:r>
-      <w:r>
-        <w:rPr>
-          <w:rFonts w:asciiTheme="majorBidi" w:hAnsiTheme="majorBidi" w:cstheme="majorBidi"/>
-          <w:b/>
-          <w:sz w:val="28"/>
-        </w:rPr>
-        <w:t xml:space="preserve"> (SEO)</w:t>
-      </w:r>
-      <w:r>
-        <w:rPr>
-          <w:rFonts w:asciiTheme="majorBidi" w:hAnsiTheme="majorBidi" w:cstheme="majorBidi" w:hint="cs"/>
-          <w:b/>
+          <w:rFonts w:asciiTheme="majorBidi" w:hAnsiTheme="majorBidi"/>
+          <w:sz w:val="28"/>
+          <w:rtl/>
+        </w:rPr>
+      </w:pPr>
+      <w:r>
+        <w:rPr>
+          <w:rFonts w:asciiTheme="majorBidi" w:hAnsiTheme="majorBidi"/>
+          <w:sz w:val="28"/>
+          <w:rtl/>
+        </w:rPr>
+        <w:t xml:space="preserve">            </w:t>
+      </w:r>
+      <w:r>
+        <w:rPr>
+          <w:rFonts w:asciiTheme="majorBidi" w:hAnsiTheme="majorBidi"/>
+          <w:sz w:val="28"/>
+        </w:rPr>
+        <w:t> </w:t>
+      </w:r>
+      <w:r>
+        <w:rPr>
+          <w:rFonts w:asciiTheme="majorBidi" w:hAnsiTheme="majorBidi"/>
+          <w:sz w:val="28"/>
+          <w:rtl/>
+        </w:rPr>
+        <w:t>نظام إدارة قواعد بيانات علائقية مفتوح المصدر ومستقر للغاية. يُستخدم في هذا المشروع لتخزين كافة البيانات الحساسة مثل معلومات المستخدمين، المواعيد الطبية، وسجلات التتبع الصحي، مع ضمان سرعة استرجاع البيانات وحمايتها من خلال تقنيات التخزين المتقدمة</w:t>
+      </w:r>
+      <w:r>
+        <w:rPr>
+          <w:rFonts w:asciiTheme="majorBidi" w:hAnsiTheme="majorBidi"/>
           <w:sz w:val="28"/>
           <w:rtl/>
         </w:rPr>
@@ -37038,11 +36801,21 @@
         </w:numPr>
         <w:spacing w:after="0"/>
         <w:rPr>
+          <w:rFonts w:asciiTheme="majorBidi" w:hAnsiTheme="majorBidi" w:cstheme="majorBidi"/>
+          <w:b/>
+          <w:sz w:val="28"/>
+        </w:rPr>
+      </w:pPr>
+      <w:r>
+        <w:rPr>
+          <w:rFonts w:asciiTheme="majorBidi" w:hAnsiTheme="majorBidi" w:cstheme="majorBidi"/>
           <w:b/>
           <w:bCs/>
-          <w:sz w:val="24"/>
-        </w:rPr>
-      </w:pPr>
+          <w:sz w:val="28"/>
+        </w:rPr>
+        <w:t>HTML</w:t>
+      </w:r>
+      <w:proofErr w:type="gramStart"/>
       <w:r>
         <w:rPr>
           <w:rFonts w:asciiTheme="majorBidi" w:hAnsiTheme="majorBidi" w:cstheme="majorBidi"/>
@@ -37050,90 +36823,186 @@
           <w:bCs/>
           <w:sz w:val="28"/>
         </w:rPr>
-        <w:t>CSS3 &amp; Vanilla CSS</w:t>
+        <w:t>5</w:t>
       </w:r>
       <w:r>
         <w:rPr>
           <w:rFonts w:asciiTheme="majorBidi" w:hAnsiTheme="majorBidi" w:cstheme="majorBidi" w:hint="cs"/>
           <w:b/>
-          <w:bCs/>
-          <w:sz w:val="28"/>
-          <w:rtl/>
-        </w:rPr>
-        <w:t>:</w:t>
-      </w:r>
+          <w:sz w:val="28"/>
+          <w:rtl/>
+        </w:rPr>
+        <w:t xml:space="preserve"> :</w:t>
+      </w:r>
+      <w:proofErr w:type="gramEnd"/>
     </w:p>
     <w:p>
       <w:pPr>
+        <w:pStyle w:val="a9"/>
         <w:spacing w:after="0"/>
         <w:jc w:val="both"/>
         <w:rPr>
-          <w:rFonts w:asciiTheme="majorBidi" w:hAnsiTheme="majorBidi"/>
-          <w:sz w:val="28"/>
-          <w:rtl/>
-        </w:rPr>
-      </w:pPr>
-      <w:r>
-        <w:rPr>
-          <w:rFonts w:asciiTheme="majorBidi" w:hAnsiTheme="majorBidi"/>
-          <w:sz w:val="28"/>
-          <w:rtl/>
-        </w:rPr>
-        <w:t xml:space="preserve">               </w:t>
-      </w:r>
-      <w:r>
-        <w:rPr>
-          <w:rFonts w:asciiTheme="majorBidi" w:hAnsiTheme="majorBidi"/>
-          <w:sz w:val="28"/>
-          <w:rtl/>
-        </w:rPr>
-        <w:t>لغة التنسيق المستخدمة لتصميم الواجهات المرئية للمنصة. تم الاعتماد على</w:t>
-      </w:r>
-      <w:r>
-        <w:rPr>
-          <w:rFonts w:asciiTheme="majorBidi" w:hAnsiTheme="majorBidi"/>
-          <w:sz w:val="28"/>
-        </w:rPr>
-        <w:t xml:space="preserve"> CSS3 </w:t>
-      </w:r>
-      <w:r>
-        <w:rPr>
-          <w:rFonts w:asciiTheme="majorBidi" w:hAnsiTheme="majorBidi"/>
-          <w:sz w:val="28"/>
-          <w:rtl/>
-        </w:rPr>
-        <w:t>لبناء تصميم عصري ومتميز يعتمد على المتغيرات</w:t>
-      </w:r>
-      <w:r>
-        <w:rPr>
-          <w:rFonts w:asciiTheme="majorBidi" w:hAnsiTheme="majorBidi"/>
-          <w:sz w:val="28"/>
-        </w:rPr>
-        <w:t xml:space="preserve"> (CSS Variables) </w:t>
-      </w:r>
-      <w:r>
-        <w:rPr>
-          <w:rFonts w:asciiTheme="majorBidi" w:hAnsiTheme="majorBidi"/>
-          <w:sz w:val="28"/>
-          <w:rtl/>
-        </w:rPr>
-        <w:t>والتنسيقات المتجاوبة، مما يضمن ظهور المنصة بشكل احترافي على كافة أحجام الشاشات (الهواتف، الأجهزة اللوحية، والحواسيب)</w:t>
-      </w:r>
-      <w:r>
-        <w:rPr>
-          <w:rFonts w:asciiTheme="majorBidi" w:hAnsiTheme="majorBidi"/>
-          <w:sz w:val="28"/>
+          <w:rFonts w:asciiTheme="majorBidi" w:hAnsiTheme="majorBidi" w:cstheme="majorBidi"/>
+          <w:b/>
+          <w:sz w:val="28"/>
+          <w:rtl/>
+        </w:rPr>
+      </w:pPr>
+      <w:r>
+        <w:rPr>
+          <w:rFonts w:asciiTheme="majorBidi" w:hAnsiTheme="majorBidi" w:cstheme="majorBidi" w:hint="cs"/>
+          <w:b/>
+          <w:sz w:val="28"/>
+          <w:rtl/>
+        </w:rPr>
+        <w:t xml:space="preserve">   </w:t>
+      </w:r>
+      <w:r>
+        <w:rPr>
+          <w:rFonts w:asciiTheme="majorBidi" w:hAnsiTheme="majorBidi" w:cstheme="majorBidi" w:hint="cs"/>
+          <w:b/>
+          <w:sz w:val="28"/>
+          <w:rtl/>
+        </w:rPr>
+        <w:t xml:space="preserve"> </w:t>
+      </w:r>
+      <w:r>
+        <w:rPr>
+          <w:rFonts w:asciiTheme="majorBidi" w:hAnsiTheme="majorBidi" w:cstheme="majorBidi" w:hint="cs"/>
+          <w:b/>
+          <w:sz w:val="28"/>
+          <w:rtl/>
+        </w:rPr>
+        <w:t xml:space="preserve">   </w:t>
+      </w:r>
+      <w:r>
+        <w:rPr>
+          <w:rFonts w:asciiTheme="majorBidi" w:hAnsiTheme="majorBidi" w:cstheme="majorBidi"/>
+          <w:b/>
+          <w:sz w:val="28"/>
+          <w:rtl/>
+        </w:rPr>
+        <w:t>لغة التوصيف الأساسية التي تُشكل الهيكل الإنشائي لصفحات المنصة الطبية. تدعم</w:t>
+      </w:r>
+      <w:r>
+        <w:rPr>
+          <w:rFonts w:asciiTheme="majorBidi" w:hAnsiTheme="majorBidi" w:cstheme="majorBidi"/>
+          <w:b/>
+          <w:sz w:val="28"/>
+        </w:rPr>
+        <w:t xml:space="preserve"> HTML</w:t>
+      </w:r>
+      <w:proofErr w:type="gramStart"/>
+      <w:r>
+        <w:rPr>
+          <w:rFonts w:asciiTheme="majorBidi" w:hAnsiTheme="majorBidi" w:cstheme="majorBidi"/>
+          <w:b/>
+          <w:sz w:val="28"/>
+        </w:rPr>
+        <w:t xml:space="preserve">5 </w:t>
+      </w:r>
+      <w:r>
+        <w:rPr>
+          <w:rFonts w:asciiTheme="majorBidi" w:hAnsiTheme="majorBidi" w:cstheme="majorBidi" w:hint="cs"/>
+          <w:b/>
+          <w:sz w:val="28"/>
+          <w:rtl/>
+        </w:rPr>
+        <w:t xml:space="preserve"> </w:t>
+      </w:r>
+      <w:r>
+        <w:rPr>
+          <w:rFonts w:asciiTheme="majorBidi" w:hAnsiTheme="majorBidi" w:cstheme="majorBidi"/>
+          <w:b/>
+          <w:sz w:val="28"/>
+          <w:rtl/>
+        </w:rPr>
+        <w:t>الميزات</w:t>
+      </w:r>
+      <w:proofErr w:type="gramEnd"/>
+      <w:r>
+        <w:rPr>
+          <w:rFonts w:asciiTheme="majorBidi" w:hAnsiTheme="majorBidi" w:cstheme="majorBidi"/>
+          <w:b/>
+          <w:sz w:val="28"/>
+          <w:rtl/>
+        </w:rPr>
+        <w:t xml:space="preserve"> الحديثة مثل الوسائط المتعددة (فيديوهات المقالات الطبية) والعناصر الدلالية</w:t>
+      </w:r>
+      <w:r>
+        <w:rPr>
+          <w:rFonts w:asciiTheme="majorBidi" w:hAnsiTheme="majorBidi" w:cstheme="majorBidi"/>
+          <w:b/>
+          <w:sz w:val="28"/>
+        </w:rPr>
+        <w:t xml:space="preserve"> (Semantic </w:t>
+      </w:r>
+      <w:proofErr w:type="gramStart"/>
+      <w:r>
+        <w:rPr>
+          <w:rFonts w:asciiTheme="majorBidi" w:hAnsiTheme="majorBidi" w:cstheme="majorBidi"/>
+          <w:b/>
+          <w:sz w:val="28"/>
+        </w:rPr>
+        <w:t xml:space="preserve">Tags) </w:t>
+      </w:r>
+      <w:r>
+        <w:rPr>
+          <w:rFonts w:asciiTheme="majorBidi" w:hAnsiTheme="majorBidi" w:cstheme="majorBidi" w:hint="cs"/>
+          <w:b/>
+          <w:sz w:val="28"/>
+          <w:rtl/>
+        </w:rPr>
+        <w:t xml:space="preserve"> </w:t>
+      </w:r>
+      <w:r>
+        <w:rPr>
+          <w:rFonts w:asciiTheme="majorBidi" w:hAnsiTheme="majorBidi" w:cstheme="majorBidi"/>
+          <w:b/>
+          <w:sz w:val="28"/>
+          <w:rtl/>
+        </w:rPr>
+        <w:t>التي</w:t>
+      </w:r>
+      <w:proofErr w:type="gramEnd"/>
+      <w:r>
+        <w:rPr>
+          <w:rFonts w:asciiTheme="majorBidi" w:hAnsiTheme="majorBidi" w:cstheme="majorBidi"/>
+          <w:b/>
+          <w:sz w:val="28"/>
+          <w:rtl/>
+        </w:rPr>
+        <w:t xml:space="preserve"> تحسن من تجربة المستخدم وأداء محركات البحث</w:t>
+      </w:r>
+      <w:r>
+        <w:rPr>
+          <w:rFonts w:asciiTheme="majorBidi" w:hAnsiTheme="majorBidi" w:cstheme="majorBidi"/>
+          <w:b/>
+          <w:sz w:val="28"/>
+        </w:rPr>
+        <w:t xml:space="preserve"> (SEO)</w:t>
+      </w:r>
+      <w:r>
+        <w:rPr>
+          <w:rFonts w:asciiTheme="majorBidi" w:hAnsiTheme="majorBidi" w:cstheme="majorBidi" w:hint="cs"/>
+          <w:b/>
+          <w:sz w:val="28"/>
+          <w:rtl/>
         </w:rPr>
         <w:t>.</w:t>
       </w:r>
-      <w:r>
-        <w:rPr>
-          <w:rFonts w:asciiTheme="majorBidi" w:hAnsiTheme="majorBidi"/>
-          <w:sz w:val="28"/>
-          <w:rtl/>
-        </w:rPr>
-        <w:t>.</w:t>
-      </w:r>
+    </w:p>
+    <w:p>
+      <w:pPr>
+        <w:pStyle w:val="a9"/>
+        <w:spacing w:after="0"/>
+        <w:jc w:val="both"/>
+        <w:rPr>
+          <w:rFonts w:asciiTheme="majorBidi" w:hAnsiTheme="majorBidi" w:cstheme="majorBidi"/>
+          <w:b/>
+          <w:sz w:val="28"/>
+        </w:rPr>
+      </w:pPr>
     </w:p>
     <w:p>
       <w:pPr>
@@ -37144,7 +37013,6 @@
         </w:numPr>
         <w:spacing w:after="0"/>
         <w:rPr>
-          <w:rFonts w:asciiTheme="majorBidi" w:hAnsiTheme="majorBidi" w:cstheme="majorBidi"/>
           <w:b/>
           <w:bCs/>
           <w:sz w:val="24"/>
@@ -37157,11 +37025,11 @@
           <w:bCs/>
           <w:sz w:val="28"/>
         </w:rPr>
-        <w:t>JavaScript (ES6+)</w:t>
-      </w:r>
-      <w:r>
-        <w:rPr>
-          <w:rFonts w:asciiTheme="majorBidi" w:hAnsiTheme="majorBidi" w:cstheme="majorBidi"/>
+        <w:t>CSS3 &amp; Vanilla CSS</w:t>
+      </w:r>
+      <w:r>
+        <w:rPr>
+          <w:rFonts w:asciiTheme="majorBidi" w:hAnsiTheme="majorBidi" w:cstheme="majorBidi" w:hint="cs"/>
           <w:b/>
           <w:bCs/>
           <w:sz w:val="28"/>
@@ -37182,11 +37050,42 @@
       </w:pPr>
       <w:r>
         <w:rPr>
+          <w:rFonts w:asciiTheme="majorBidi" w:hAnsiTheme="majorBidi"/>
+          <w:sz w:val="28"/>
+          <w:rtl/>
+        </w:rPr>
+        <w:t xml:space="preserve">               </w:t>
+      </w:r>
+      <w:r>
+        <w:rPr>
+          <w:rFonts w:asciiTheme="majorBidi" w:hAnsiTheme="majorBidi"/>
+          <w:sz w:val="28"/>
+          <w:rtl/>
+        </w:rPr>
+        <w:t>لغة التنسيق المستخدمة لتصميم الواجهات المرئية للمنصة. تم الاعتماد على</w:t>
+      </w:r>
+      <w:r>
+        <w:rPr>
+          <w:rFonts w:asciiTheme="majorBidi" w:hAnsiTheme="majorBidi"/>
+          <w:sz w:val="28"/>
+        </w:rPr>
+        <w:t xml:space="preserve"> CSS3 </w:t>
+      </w:r>
+      <w:r>
+        <w:rPr>
+          <w:rFonts w:asciiTheme="majorBidi" w:hAnsiTheme="majorBidi"/>
+          <w:sz w:val="28"/>
+          <w:rtl/>
+        </w:rPr>
+        <w:t xml:space="preserve">لبناء </w:t>
+      </w:r>
+      <w:r>
+        <w:rPr>
           <w:rFonts w:asciiTheme="majorBidi" w:hAnsiTheme="majorBidi" w:hint="cs"/>
           <w:sz w:val="28"/>
           <w:rtl/>
         </w:rPr>
-        <w:t xml:space="preserve">              </w:t>
+        <w:t xml:space="preserve">    </w:t>
       </w:r>
       <w:r>
         <w:rPr>
@@ -37194,86 +37093,40 @@
           <w:sz w:val="28"/>
           <w:rtl/>
         </w:rPr>
-        <w:t>اللغة البرمجية الأساسية لإضافة التفاعل والديناميكية في الواجهة الأمامية للمنصة. تُستخدم جافا سكريبت لإدارة العمليات في المتصفح مثل حساب كتلة الجسم</w:t>
+        <w:t>تصميم عصري ومتميز يعتمد على المتغيرات</w:t>
       </w:r>
       <w:r>
         <w:rPr>
           <w:rFonts w:asciiTheme="majorBidi" w:hAnsiTheme="majorBidi"/>
           <w:sz w:val="28"/>
         </w:rPr>
-        <w:t xml:space="preserve"> (BMI</w:t>
-      </w:r>
-      <w:proofErr w:type="gramStart"/>
+        <w:t xml:space="preserve"> (CSS Variables) </w:t>
+      </w:r>
       <w:r>
         <w:rPr>
           <w:rFonts w:asciiTheme="majorBidi" w:hAnsiTheme="majorBidi"/>
           <w:sz w:val="28"/>
-        </w:rPr>
-        <w:t>)</w:t>
+          <w:rtl/>
+        </w:rPr>
+        <w:t>والتنسيقات المتجاوبة، مما يضمن ظهور المنصة بشكل احترافي على كافة أحجام الشاشات (الهواتف، الأجهزة اللوحية، والحواسيب)</w:t>
       </w:r>
       <w:r>
         <w:rPr>
           <w:rFonts w:asciiTheme="majorBidi" w:hAnsiTheme="majorBidi"/>
           <w:sz w:val="28"/>
         </w:rPr>
-        <w:t xml:space="preserve"> </w:t>
-      </w:r>
-      <w:r>
+        <w:t>.</w:t>
+      </w:r>
+    </w:p>
+    <w:p>
+      <w:pPr>
+        <w:spacing w:after="0"/>
+        <w:jc w:val="both"/>
         <w:rPr>
           <w:rFonts w:asciiTheme="majorBidi" w:hAnsiTheme="majorBidi"/>
           <w:sz w:val="28"/>
-          <w:rtl/>
-        </w:rPr>
-        <w:t>،</w:t>
-      </w:r>
-      <w:proofErr w:type="gramEnd"/>
-      <w:r>
-        <w:rPr>
-          <w:rFonts w:asciiTheme="majorBidi" w:hAnsiTheme="majorBidi"/>
-          <w:sz w:val="28"/>
-          <w:rtl/>
-        </w:rPr>
-        <w:t xml:space="preserve"> تحديث بيانات التتبع الصحي </w:t>
-      </w:r>
-      <w:r>
-        <w:rPr>
-          <w:rFonts w:asciiTheme="majorBidi" w:hAnsiTheme="majorBidi"/>
-          <w:sz w:val="28"/>
-          <w:rtl/>
-        </w:rPr>
-        <w:lastRenderedPageBreak/>
-        <w:t>لحظياً، والاتصال بواجهات البرمجة</w:t>
-      </w:r>
-      <w:r>
-        <w:rPr>
-          <w:rFonts w:asciiTheme="majorBidi" w:hAnsiTheme="majorBidi"/>
-          <w:sz w:val="28"/>
-        </w:rPr>
-        <w:t xml:space="preserve"> (APIs) </w:t>
-      </w:r>
-      <w:r>
-        <w:rPr>
-          <w:rFonts w:asciiTheme="majorBidi" w:hAnsiTheme="majorBidi"/>
-          <w:sz w:val="28"/>
-          <w:rtl/>
-        </w:rPr>
-        <w:t>لجلب المقالات والمواعيد دون الحاجة لإعادة تحميل الصفحة</w:t>
-      </w:r>
-      <w:r>
-        <w:rPr>
-          <w:rFonts w:asciiTheme="majorBidi" w:hAnsiTheme="majorBidi"/>
-          <w:sz w:val="28"/>
-        </w:rPr>
-        <w:t>.</w:t>
-      </w:r>
-      <w:r>
-        <w:rPr>
-          <w:rFonts w:asciiTheme="majorBidi" w:hAnsiTheme="majorBidi"/>
-          <w:sz w:val="28"/>
-          <w:rtl/>
-        </w:rPr>
-        <w:t>.</w:t>
-      </w:r>
+        </w:rPr>
+      </w:pPr>
     </w:p>
     <w:p>
       <w:pPr>
@@ -37284,6 +37137,7 @@
         </w:numPr>
         <w:spacing w:after="0"/>
         <w:rPr>
+          <w:rFonts w:asciiTheme="majorBidi" w:hAnsiTheme="majorBidi" w:cstheme="majorBidi"/>
           <w:b/>
           <w:bCs/>
           <w:sz w:val="24"/>
@@ -37296,6 +37150,137 @@
           <w:bCs/>
           <w:sz w:val="28"/>
         </w:rPr>
+        <w:t>JavaScript (ES6+)</w:t>
+      </w:r>
+      <w:r>
+        <w:rPr>
+          <w:rFonts w:asciiTheme="majorBidi" w:hAnsiTheme="majorBidi" w:cstheme="majorBidi"/>
+          <w:b/>
+          <w:bCs/>
+          <w:sz w:val="28"/>
+          <w:rtl/>
+        </w:rPr>
+        <w:t>:</w:t>
+      </w:r>
+    </w:p>
+    <w:p>
+      <w:pPr>
+        <w:spacing w:after="0"/>
+        <w:jc w:val="both"/>
+        <w:rPr>
+          <w:rFonts w:asciiTheme="majorBidi" w:hAnsiTheme="majorBidi"/>
+          <w:sz w:val="28"/>
+          <w:rtl/>
+        </w:rPr>
+      </w:pPr>
+      <w:r>
+        <w:rPr>
+          <w:rFonts w:asciiTheme="majorBidi" w:hAnsiTheme="majorBidi" w:hint="cs"/>
+          <w:sz w:val="28"/>
+          <w:rtl/>
+        </w:rPr>
+        <w:t xml:space="preserve">              </w:t>
+      </w:r>
+      <w:r>
+        <w:rPr>
+          <w:rFonts w:asciiTheme="majorBidi" w:hAnsiTheme="majorBidi"/>
+          <w:sz w:val="28"/>
+          <w:rtl/>
+        </w:rPr>
+        <w:t>اللغة البرمجية الأساسية لإضافة التفاعل والديناميكية في الواجهة الأمامية للمنصة. تُستخدم جافا سكريبت لإدارة العمليات في المتصفح مثل حساب كتلة الجسم</w:t>
+      </w:r>
+      <w:r>
+        <w:rPr>
+          <w:rFonts w:asciiTheme="majorBidi" w:hAnsiTheme="majorBidi"/>
+          <w:sz w:val="28"/>
+        </w:rPr>
+        <w:t xml:space="preserve"> (BMI</w:t>
+      </w:r>
+      <w:proofErr w:type="gramStart"/>
+      <w:r>
+        <w:rPr>
+          <w:rFonts w:asciiTheme="majorBidi" w:hAnsiTheme="majorBidi"/>
+          <w:sz w:val="28"/>
+        </w:rPr>
+        <w:t>)</w:t>
+      </w:r>
+      <w:r>
+        <w:rPr>
+          <w:rFonts w:asciiTheme="majorBidi" w:hAnsiTheme="majorBidi"/>
+          <w:sz w:val="28"/>
+        </w:rPr>
+        <w:t xml:space="preserve"> </w:t>
+      </w:r>
+      <w:r>
+        <w:rPr>
+          <w:rFonts w:asciiTheme="majorBidi" w:hAnsiTheme="majorBidi"/>
+          <w:sz w:val="28"/>
+          <w:rtl/>
+        </w:rPr>
+        <w:t>،</w:t>
+      </w:r>
+      <w:proofErr w:type="gramEnd"/>
+      <w:r>
+        <w:rPr>
+          <w:rFonts w:asciiTheme="majorBidi" w:hAnsiTheme="majorBidi"/>
+          <w:sz w:val="28"/>
+          <w:rtl/>
+        </w:rPr>
+        <w:t xml:space="preserve"> تحديث بيانات التتبع الصحي لحظياً، والاتصال بواجهات البرمجة</w:t>
+      </w:r>
+      <w:r>
+        <w:rPr>
+          <w:rFonts w:asciiTheme="majorBidi" w:hAnsiTheme="majorBidi"/>
+          <w:sz w:val="28"/>
+        </w:rPr>
+        <w:t xml:space="preserve"> (APIs) </w:t>
+      </w:r>
+      <w:r>
+        <w:rPr>
+          <w:rFonts w:asciiTheme="majorBidi" w:hAnsiTheme="majorBidi"/>
+          <w:sz w:val="28"/>
+          <w:rtl/>
+        </w:rPr>
+        <w:t>لجلب المقالات والمواعيد دون الحاجة لإعادة تحميل الصفحة</w:t>
+      </w:r>
+      <w:r>
+        <w:rPr>
+          <w:rFonts w:asciiTheme="majorBidi" w:hAnsiTheme="majorBidi"/>
+          <w:sz w:val="28"/>
+        </w:rPr>
+        <w:t>.</w:t>
+      </w:r>
+      <w:r>
+        <w:rPr>
+          <w:rFonts w:asciiTheme="majorBidi" w:hAnsiTheme="majorBidi"/>
+          <w:sz w:val="28"/>
+          <w:rtl/>
+        </w:rPr>
+        <w:t>.</w:t>
+      </w:r>
+    </w:p>
+    <w:p>
+      <w:pPr>
+        <w:pStyle w:val="a9"/>
+        <w:numPr>
+          <w:ilvl w:val="0"/>
+          <w:numId w:val="7"/>
+        </w:numPr>
+        <w:spacing w:after="0"/>
+        <w:rPr>
+          <w:b/>
+          <w:bCs/>
+          <w:sz w:val="24"/>
+        </w:rPr>
+      </w:pPr>
+      <w:r>
+        <w:rPr>
+          <w:rFonts w:asciiTheme="majorBidi" w:hAnsiTheme="majorBidi" w:cstheme="majorBidi"/>
+          <w:b/>
+          <w:bCs/>
+          <w:sz w:val="28"/>
+        </w:rPr>
+        <w:lastRenderedPageBreak/>
         <w:t>Firebase (Cloud Messaging)</w:t>
       </w:r>
       <w:r>
@@ -38517,142 +38502,150 @@
           <w:sz w:val="28"/>
           <w:rtl/>
         </w:rPr>
+        <w:t xml:space="preserve">              </w:t>
+      </w:r>
+      <w:r>
+        <w:rPr>
+          <w:rFonts w:asciiTheme="majorBidi" w:hAnsiTheme="majorBidi"/>
+          <w:sz w:val="28"/>
+          <w:rtl/>
+        </w:rPr>
+        <w:t xml:space="preserve">نظام </w:t>
+      </w:r>
+      <w:r>
+        <w:rPr>
+          <w:rFonts w:asciiTheme="majorBidi" w:hAnsiTheme="majorBidi"/>
+          <w:sz w:val="28"/>
+          <w:rtl/>
+        </w:rPr>
+        <w:t>موزع</w:t>
+      </w:r>
+      <w:r>
+        <w:rPr>
+          <w:rFonts w:asciiTheme="majorBidi" w:hAnsiTheme="majorBidi"/>
+          <w:sz w:val="28"/>
+          <w:rtl/>
+        </w:rPr>
+        <w:t xml:space="preserve"> لإدارة الإصدارات</w:t>
+      </w:r>
+      <w:r>
+        <w:rPr>
+          <w:rFonts w:asciiTheme="majorBidi" w:hAnsiTheme="majorBidi"/>
+          <w:sz w:val="28"/>
+        </w:rPr>
+        <w:t xml:space="preserve"> (</w:t>
+      </w:r>
+      <w:r>
+        <w:rPr>
+          <w:rFonts w:asciiTheme="majorBidi" w:hAnsiTheme="majorBidi"/>
+          <w:sz w:val="28"/>
+        </w:rPr>
+        <w:t xml:space="preserve">Distributed </w:t>
+      </w:r>
+      <w:r>
+        <w:rPr>
+          <w:rFonts w:asciiTheme="majorBidi" w:hAnsiTheme="majorBidi"/>
+          <w:sz w:val="28"/>
+        </w:rPr>
+        <w:t xml:space="preserve">Version Control </w:t>
+      </w:r>
+      <w:proofErr w:type="gramStart"/>
+      <w:r>
+        <w:rPr>
+          <w:rFonts w:asciiTheme="majorBidi" w:hAnsiTheme="majorBidi"/>
+          <w:sz w:val="28"/>
+        </w:rPr>
+        <w:t xml:space="preserve">System)  </w:t>
+      </w:r>
+      <w:r>
+        <w:rPr>
+          <w:rFonts w:asciiTheme="majorBidi" w:hAnsiTheme="majorBidi"/>
+          <w:sz w:val="28"/>
+          <w:rtl/>
+        </w:rPr>
+        <w:t>مفتوح</w:t>
+      </w:r>
+      <w:proofErr w:type="gramEnd"/>
+      <w:r>
+        <w:rPr>
+          <w:rFonts w:asciiTheme="majorBidi" w:hAnsiTheme="majorBidi"/>
+          <w:sz w:val="28"/>
+          <w:rtl/>
+        </w:rPr>
+        <w:t xml:space="preserve"> </w:t>
+      </w:r>
+      <w:proofErr w:type="gramStart"/>
+      <w:r>
+        <w:rPr>
+          <w:rFonts w:asciiTheme="majorBidi" w:hAnsiTheme="majorBidi"/>
+          <w:sz w:val="28"/>
+          <w:rtl/>
+        </w:rPr>
+        <w:t>المصدر</w:t>
+      </w:r>
+      <w:r>
+        <w:rPr>
+          <w:rFonts w:asciiTheme="majorBidi" w:hAnsiTheme="majorBidi"/>
+          <w:sz w:val="28"/>
+          <w:rtl/>
+        </w:rPr>
+        <w:t xml:space="preserve"> ،</w:t>
+      </w:r>
+      <w:proofErr w:type="gramEnd"/>
+      <w:r>
+        <w:rPr>
+          <w:rFonts w:asciiTheme="majorBidi" w:hAnsiTheme="majorBidi"/>
+          <w:sz w:val="28"/>
+          <w:rtl/>
+        </w:rPr>
+        <w:t xml:space="preserve"> يُستخدم</w:t>
+      </w:r>
+      <w:r>
+        <w:rPr>
+          <w:rFonts w:asciiTheme="majorBidi" w:hAnsiTheme="majorBidi"/>
+          <w:sz w:val="28"/>
+        </w:rPr>
+        <w:t xml:space="preserve"> Git </w:t>
+      </w:r>
+      <w:r>
+        <w:rPr>
+          <w:rFonts w:asciiTheme="majorBidi" w:hAnsiTheme="majorBidi"/>
+          <w:sz w:val="28"/>
+          <w:rtl/>
+        </w:rPr>
+        <w:t xml:space="preserve">لتتبع التغييرات </w:t>
+      </w:r>
+      <w:r>
+        <w:rPr>
+          <w:rFonts w:asciiTheme="majorBidi" w:hAnsiTheme="majorBidi"/>
+          <w:sz w:val="28"/>
+          <w:rtl/>
+        </w:rPr>
+        <w:t xml:space="preserve">في ملفات المشروع والتنسيق بين فرق التطوير. يتيح </w:t>
+      </w:r>
+      <w:r>
+        <w:rPr>
+          <w:rFonts w:asciiTheme="majorBidi" w:hAnsiTheme="majorBidi"/>
+          <w:sz w:val="28"/>
+        </w:rPr>
+        <w:t>Git</w:t>
+      </w:r>
+      <w:r>
+        <w:rPr>
+          <w:rFonts w:asciiTheme="majorBidi" w:hAnsiTheme="majorBidi"/>
+          <w:sz w:val="28"/>
+          <w:rtl/>
+        </w:rPr>
+        <w:t xml:space="preserve"> للمطورين </w:t>
+      </w:r>
+      <w:r>
+        <w:rPr>
+          <w:rFonts w:asciiTheme="majorBidi" w:hAnsiTheme="majorBidi"/>
+          <w:sz w:val="28"/>
+          <w:rtl/>
+        </w:rPr>
         <w:lastRenderedPageBreak/>
-        <w:t xml:space="preserve">              </w:t>
-      </w:r>
-      <w:r>
-        <w:rPr>
-          <w:rFonts w:asciiTheme="majorBidi" w:hAnsiTheme="majorBidi"/>
-          <w:sz w:val="28"/>
-          <w:rtl/>
-        </w:rPr>
-        <w:t xml:space="preserve">نظام </w:t>
-      </w:r>
-      <w:r>
-        <w:rPr>
-          <w:rFonts w:asciiTheme="majorBidi" w:hAnsiTheme="majorBidi"/>
-          <w:sz w:val="28"/>
-          <w:rtl/>
-        </w:rPr>
-        <w:t>موزع</w:t>
-      </w:r>
-      <w:r>
-        <w:rPr>
-          <w:rFonts w:asciiTheme="majorBidi" w:hAnsiTheme="majorBidi"/>
-          <w:sz w:val="28"/>
-          <w:rtl/>
-        </w:rPr>
-        <w:t xml:space="preserve"> لإدارة الإصدارات</w:t>
-      </w:r>
-      <w:r>
-        <w:rPr>
-          <w:rFonts w:asciiTheme="majorBidi" w:hAnsiTheme="majorBidi"/>
-          <w:sz w:val="28"/>
-        </w:rPr>
-        <w:t xml:space="preserve"> (</w:t>
-      </w:r>
-      <w:r>
-        <w:rPr>
-          <w:rFonts w:asciiTheme="majorBidi" w:hAnsiTheme="majorBidi"/>
-          <w:sz w:val="28"/>
-        </w:rPr>
-        <w:t xml:space="preserve">Distributed </w:t>
-      </w:r>
-      <w:r>
-        <w:rPr>
-          <w:rFonts w:asciiTheme="majorBidi" w:hAnsiTheme="majorBidi"/>
-          <w:sz w:val="28"/>
-        </w:rPr>
-        <w:t xml:space="preserve">Version Control </w:t>
-      </w:r>
-      <w:proofErr w:type="gramStart"/>
-      <w:r>
-        <w:rPr>
-          <w:rFonts w:asciiTheme="majorBidi" w:hAnsiTheme="majorBidi"/>
-          <w:sz w:val="28"/>
-        </w:rPr>
-        <w:t xml:space="preserve">System)  </w:t>
-      </w:r>
-      <w:r>
-        <w:rPr>
-          <w:rFonts w:asciiTheme="majorBidi" w:hAnsiTheme="majorBidi"/>
-          <w:sz w:val="28"/>
-          <w:rtl/>
-        </w:rPr>
-        <w:t>مفتوح</w:t>
-      </w:r>
-      <w:proofErr w:type="gramEnd"/>
-      <w:r>
-        <w:rPr>
-          <w:rFonts w:asciiTheme="majorBidi" w:hAnsiTheme="majorBidi"/>
-          <w:sz w:val="28"/>
-          <w:rtl/>
-        </w:rPr>
-        <w:t xml:space="preserve"> </w:t>
-      </w:r>
-      <w:proofErr w:type="gramStart"/>
-      <w:r>
-        <w:rPr>
-          <w:rFonts w:asciiTheme="majorBidi" w:hAnsiTheme="majorBidi"/>
-          <w:sz w:val="28"/>
-          <w:rtl/>
-        </w:rPr>
-        <w:t>المصدر</w:t>
-      </w:r>
-      <w:r>
-        <w:rPr>
-          <w:rFonts w:asciiTheme="majorBidi" w:hAnsiTheme="majorBidi"/>
-          <w:sz w:val="28"/>
-          <w:rtl/>
-        </w:rPr>
-        <w:t xml:space="preserve"> ،</w:t>
-      </w:r>
-      <w:proofErr w:type="gramEnd"/>
-      <w:r>
-        <w:rPr>
-          <w:rFonts w:asciiTheme="majorBidi" w:hAnsiTheme="majorBidi"/>
-          <w:sz w:val="28"/>
-          <w:rtl/>
-        </w:rPr>
-        <w:t xml:space="preserve"> يُستخدم</w:t>
-      </w:r>
-      <w:r>
-        <w:rPr>
-          <w:rFonts w:asciiTheme="majorBidi" w:hAnsiTheme="majorBidi"/>
-          <w:sz w:val="28"/>
-        </w:rPr>
-        <w:t xml:space="preserve"> Git </w:t>
-      </w:r>
-      <w:r>
-        <w:rPr>
-          <w:rFonts w:asciiTheme="majorBidi" w:hAnsiTheme="majorBidi"/>
-          <w:sz w:val="28"/>
-          <w:rtl/>
-        </w:rPr>
-        <w:t xml:space="preserve">لتتبع التغييرات </w:t>
-      </w:r>
-      <w:r>
-        <w:rPr>
-          <w:rFonts w:asciiTheme="majorBidi" w:hAnsiTheme="majorBidi"/>
-          <w:sz w:val="28"/>
-          <w:rtl/>
-        </w:rPr>
-        <w:t xml:space="preserve">في ملفات المشروع والتنسيق بين فرق التطوير. يتيح </w:t>
-      </w:r>
-      <w:r>
-        <w:rPr>
-          <w:rFonts w:asciiTheme="majorBidi" w:hAnsiTheme="majorBidi"/>
-          <w:sz w:val="28"/>
-        </w:rPr>
-        <w:t>Git</w:t>
-      </w:r>
-      <w:r>
-        <w:rPr>
-          <w:rFonts w:asciiTheme="majorBidi" w:hAnsiTheme="majorBidi"/>
-          <w:sz w:val="28"/>
-          <w:rtl/>
-        </w:rPr>
-        <w:t xml:space="preserve"> للمطورين العمل على نسخ متعددة من المشروع في نفس الوقت، دمج التغييرات بسهولة، والرجوع إلى الإصدارات السابقة عند الحاجة. يتميز بسرعة الأداء، كفاءته في التعامل مع المشاريع الكبيرة، ودعمه للعمل الموزع (</w:t>
+        <w:t>العمل على نسخ متعددة من المشروع في نفس الوقت، دمج التغييرات بسهولة، والرجوع إلى الإصدارات السابقة عند الحاجة. يتميز بسرعة الأداء، كفاءته في التعامل مع المشاريع الكبيرة، ودعمه للعمل الموزع (</w:t>
       </w:r>
       <w:r>
         <w:rPr>
@@ -39245,7 +39238,6 @@
         <w:rPr>
           <w:rFonts w:asciiTheme="majorBidi" w:hAnsiTheme="majorBidi"/>
           <w:b/>
-          <w:bCs w:val="0"/>
           <w:sz w:val="28"/>
         </w:rPr>
         <w:t>Chapter</w:t>
@@ -39257,7 +39249,6 @@
         <w:rPr>
           <w:rFonts w:asciiTheme="majorBidi" w:hAnsiTheme="majorBidi"/>
           <w:b/>
-          <w:bCs w:val="0"/>
           <w:sz w:val="28"/>
         </w:rPr>
         <w:t>Summary</w:t>
@@ -43842,7 +43833,6 @@
           <w:color w:val="1F1F1F"/>
           <w:rtl/>
         </w:rPr>
-        <w:lastRenderedPageBreak/>
         <w:t>المسؤوليات الرئيسية</w:t>
       </w:r>
       <w:r>
@@ -43874,6 +43864,7 @@
           <w:color w:val="1F1F1F"/>
           <w:rtl/>
         </w:rPr>
+        <w:lastRenderedPageBreak/>
         <w:t>الاطلاع على التقارير الإحصائية العامة (نسب النجاح، نسب الحضور الإجمالية على مستوى الكلية)</w:t>
       </w:r>
       <w:r>
@@ -51959,7 +51950,7 @@
   <w:abstractNum w:abstractNumId="0" w15:restartNumberingAfterBreak="0">
     <w:nsid w:val="0E31217E"/>
     <w:multiLevelType w:val="multilevel"/>
-    <w:tmpl w:val="DAA47BC0"/>
+    <w:tmpl w:val="222A1AB2"/>
     <w:lvl w:ilvl="0">
       <w:start w:val="1"/>
       <w:numFmt w:val="decimal"/>
@@ -52137,29 +52128,30 @@
   <w:abstractNum w:abstractNumId="1" w15:restartNumberingAfterBreak="0">
     <w:nsid w:val="0F695EEC"/>
     <w:multiLevelType w:val="hybridMultilevel"/>
-    <w:tmpl w:val="E61C4D48"/>
-    <w:lvl w:ilvl="0" w:tplc="04090001">
+    <w:tmpl w:val="D9EA8D44"/>
+    <w:lvl w:ilvl="0" w:tplc="04090003">
       <w:start w:val="1"/>
       <w:numFmt w:val="bullet"/>
-      <w:lvlText w:val=""/>
+      <w:lvlText w:val="o"/>
       <w:lvlJc w:val="left"/>
       <w:pPr>
         <w:ind w:left="706"/>
       </w:pPr>
       <w:rPr>
-        <w:rFonts w:ascii="Symbol" w:hAnsi="Symbol" w:hint="default"/>
+        <w:rFonts w:ascii="Courier New" w:hAnsi="Courier New" w:cs="Courier New" w:hint="default"/>
         <w:b/>
         <w:bCs/>
         <w:i w:val="0"/>
         <w:strike w:val="0"/>
         <w:dstrike w:val="0"/>
         <w:color w:val="000000"/>
-        <w:sz w:val="26"/>
+        <w:sz w:val="24"/>
         <w:szCs w:val="26"/>
         <w:u w:val="none" w:color="000000"/>
         <w:bdr w:val="none" w:sz="0" w:space="0" w:color="auto"/>
         <w:shd w:val="clear" w:color="auto" w:fill="auto"/>
         <w:vertAlign w:val="baseline"/>
+        <w:lang w:bidi="ar-SA"/>
       </w:rPr>
     </w:lvl>
     <w:lvl w:ilvl="1" w:tplc="A490D30E">
@@ -53162,6 +53154,119 @@
     </w:lvl>
   </w:abstractNum>
   <w:abstractNum w:abstractNumId="10" w15:restartNumberingAfterBreak="0">
+    <w:nsid w:val="4B0376B7"/>
+    <w:multiLevelType w:val="hybridMultilevel"/>
+    <w:tmpl w:val="6F6C075E"/>
+    <w:lvl w:ilvl="0" w:tplc="04090003">
+      <w:start w:val="1"/>
+      <w:numFmt w:val="bullet"/>
+      <w:lvlText w:val="o"/>
+      <w:lvlJc w:val="left"/>
+      <w:pPr>
+        <w:ind w:left="1080" w:hanging="360"/>
+      </w:pPr>
+      <w:rPr>
+        <w:rFonts w:ascii="Courier New" w:hAnsi="Courier New" w:cs="Courier New" w:hint="default"/>
+      </w:rPr>
+    </w:lvl>
+    <w:lvl w:ilvl="1" w:tplc="04090003" w:tentative="1">
+      <w:start w:val="1"/>
+      <w:numFmt w:val="bullet"/>
+      <w:lvlText w:val="o"/>
+      <w:lvlJc w:val="left"/>
+      <w:pPr>
+        <w:ind w:left="1800" w:hanging="360"/>
+      </w:pPr>
+      <w:rPr>
+        <w:rFonts w:ascii="Courier New" w:hAnsi="Courier New" w:cs="Courier New" w:hint="default"/>
+      </w:rPr>
+    </w:lvl>
+    <w:lvl w:ilvl="2" w:tplc="04090005" w:tentative="1">
+      <w:start w:val="1"/>
+      <w:numFmt w:val="bullet"/>
+      <w:lvlText w:val=""/>
+      <w:lvlJc w:val="left"/>
+      <w:pPr>
+        <w:ind w:left="2520" w:hanging="360"/>
+      </w:pPr>
+      <w:rPr>
+        <w:rFonts w:ascii="Wingdings" w:hAnsi="Wingdings" w:hint="default"/>
+      </w:rPr>
+    </w:lvl>
+    <w:lvl w:ilvl="3" w:tplc="04090001" w:tentative="1">
+      <w:start w:val="1"/>
+      <w:numFmt w:val="bullet"/>
+      <w:lvlText w:val=""/>
+      <w:lvlJc w:val="left"/>
+      <w:pPr>
+        <w:ind w:left="3240" w:hanging="360"/>
+      </w:pPr>
+      <w:rPr>
+        <w:rFonts w:ascii="Symbol" w:hAnsi="Symbol" w:hint="default"/>
+      </w:rPr>
+    </w:lvl>
+    <w:lvl w:ilvl="4" w:tplc="04090003" w:tentative="1">
+      <w:start w:val="1"/>
+      <w:numFmt w:val="bullet"/>
+      <w:lvlText w:val="o"/>
+      <w:lvlJc w:val="left"/>
+      <w:pPr>
+        <w:ind w:left="3960" w:hanging="360"/>
+      </w:pPr>
+      <w:rPr>
+        <w:rFonts w:ascii="Courier New" w:hAnsi="Courier New" w:cs="Courier New" w:hint="default"/>
+      </w:rPr>
+    </w:lvl>
+    <w:lvl w:ilvl="5" w:tplc="04090005" w:tentative="1">
+      <w:start w:val="1"/>
+      <w:numFmt w:val="bullet"/>
+      <w:lvlText w:val=""/>
+      <w:lvlJc w:val="left"/>
+      <w:pPr>
+        <w:ind w:left="4680" w:hanging="360"/>
+      </w:pPr>
+      <w:rPr>
+        <w:rFonts w:ascii="Wingdings" w:hAnsi="Wingdings" w:hint="default"/>
+      </w:rPr>
+    </w:lvl>
+    <w:lvl w:ilvl="6" w:tplc="04090001" w:tentative="1">
+      <w:start w:val="1"/>
+      <w:numFmt w:val="bullet"/>
+      <w:lvlText w:val=""/>
+      <w:lvlJc w:val="left"/>
+      <w:pPr>
+        <w:ind w:left="5400" w:hanging="360"/>
+      </w:pPr>
+      <w:rPr>
+        <w:rFonts w:ascii="Symbol" w:hAnsi="Symbol" w:hint="default"/>
+      </w:rPr>
+    </w:lvl>
+    <w:lvl w:ilvl="7" w:tplc="04090003" w:tentative="1">
+      <w:start w:val="1"/>
+      <w:numFmt w:val="bullet"/>
+      <w:lvlText w:val="o"/>
+      <w:lvlJc w:val="left"/>
+      <w:pPr>
+        <w:ind w:left="6120" w:hanging="360"/>
+      </w:pPr>
+      <w:rPr>
+        <w:rFonts w:ascii="Courier New" w:hAnsi="Courier New" w:cs="Courier New" w:hint="default"/>
+      </w:rPr>
+    </w:lvl>
+    <w:lvl w:ilvl="8" w:tplc="04090005" w:tentative="1">
+      <w:start w:val="1"/>
+      <w:numFmt w:val="bullet"/>
+      <w:lvlText w:val=""/>
+      <w:lvlJc w:val="left"/>
+      <w:pPr>
+        <w:ind w:left="6840" w:hanging="360"/>
+      </w:pPr>
+      <w:rPr>
+        <w:rFonts w:ascii="Wingdings" w:hAnsi="Wingdings" w:hint="default"/>
+      </w:rPr>
+    </w:lvl>
+  </w:abstractNum>
+  <w:abstractNum w:abstractNumId="11" w15:restartNumberingAfterBreak="0">
     <w:nsid w:val="4B496195"/>
     <w:multiLevelType w:val="hybridMultilevel"/>
     <w:tmpl w:val="129C2C1E"/>
@@ -53382,7 +53487,7 @@
       </w:rPr>
     </w:lvl>
   </w:abstractNum>
-  <w:abstractNum w:abstractNumId="11" w15:restartNumberingAfterBreak="0">
+  <w:abstractNum w:abstractNumId="12" w15:restartNumberingAfterBreak="0">
     <w:nsid w:val="4E887778"/>
     <w:multiLevelType w:val="multilevel"/>
     <w:tmpl w:val="CA7C7794"/>
@@ -53496,10 +53601,209 @@
       </w:rPr>
     </w:lvl>
   </w:abstractNum>
-  <w:abstractNum w:abstractNumId="12" w15:restartNumberingAfterBreak="0">
+  <w:abstractNum w:abstractNumId="13" w15:restartNumberingAfterBreak="0">
+    <w:nsid w:val="51A62010"/>
+    <w:multiLevelType w:val="multilevel"/>
+    <w:tmpl w:val="0409001F"/>
+    <w:lvl w:ilvl="0">
+      <w:start w:val="1"/>
+      <w:numFmt w:val="decimal"/>
+      <w:lvlText w:val="%1."/>
+      <w:lvlJc w:val="left"/>
+      <w:pPr>
+        <w:ind w:left="360" w:hanging="360"/>
+      </w:pPr>
+    </w:lvl>
+    <w:lvl w:ilvl="1">
+      <w:start w:val="1"/>
+      <w:numFmt w:val="decimal"/>
+      <w:lvlText w:val="%1.%2."/>
+      <w:lvlJc w:val="left"/>
+      <w:pPr>
+        <w:ind w:left="792" w:hanging="432"/>
+      </w:pPr>
+    </w:lvl>
+    <w:lvl w:ilvl="2">
+      <w:start w:val="1"/>
+      <w:numFmt w:val="decimal"/>
+      <w:lvlText w:val="%1.%2.%3."/>
+      <w:lvlJc w:val="left"/>
+      <w:pPr>
+        <w:ind w:left="1224" w:hanging="504"/>
+      </w:pPr>
+    </w:lvl>
+    <w:lvl w:ilvl="3">
+      <w:start w:val="1"/>
+      <w:numFmt w:val="decimal"/>
+      <w:lvlText w:val="%1.%2.%3.%4."/>
+      <w:lvlJc w:val="left"/>
+      <w:pPr>
+        <w:ind w:left="1728" w:hanging="648"/>
+      </w:pPr>
+    </w:lvl>
+    <w:lvl w:ilvl="4">
+      <w:start w:val="1"/>
+      <w:numFmt w:val="decimal"/>
+      <w:lvlText w:val="%1.%2.%3.%4.%5."/>
+      <w:lvlJc w:val="left"/>
+      <w:pPr>
+        <w:ind w:left="2232" w:hanging="792"/>
+      </w:pPr>
+    </w:lvl>
+    <w:lvl w:ilvl="5">
+      <w:start w:val="1"/>
+      <w:numFmt w:val="decimal"/>
+      <w:lvlText w:val="%1.%2.%3.%4.%5.%6."/>
+      <w:lvlJc w:val="left"/>
+      <w:pPr>
+        <w:ind w:left="2736" w:hanging="936"/>
+      </w:pPr>
+    </w:lvl>
+    <w:lvl w:ilvl="6">
+      <w:start w:val="1"/>
+      <w:numFmt w:val="decimal"/>
+      <w:lvlText w:val="%1.%2.%3.%4.%5.%6.%7."/>
+      <w:lvlJc w:val="left"/>
+      <w:pPr>
+        <w:ind w:left="3240" w:hanging="1080"/>
+      </w:pPr>
+    </w:lvl>
+    <w:lvl w:ilvl="7">
+      <w:start w:val="1"/>
+      <w:numFmt w:val="decimal"/>
+      <w:lvlText w:val="%1.%2.%3.%4.%5.%6.%7.%8."/>
+      <w:lvlJc w:val="left"/>
+      <w:pPr>
+        <w:ind w:left="3744" w:hanging="1224"/>
+      </w:pPr>
+    </w:lvl>
+    <w:lvl w:ilvl="8">
+      <w:start w:val="1"/>
+      <w:numFmt w:val="decimal"/>
+      <w:lvlText w:val="%1.%2.%3.%4.%5.%6.%7.%8.%9."/>
+      <w:lvlJc w:val="left"/>
+      <w:pPr>
+        <w:ind w:left="4320" w:hanging="1440"/>
+      </w:pPr>
+    </w:lvl>
+  </w:abstractNum>
+  <w:abstractNum w:abstractNumId="14" w15:restartNumberingAfterBreak="0">
+    <w:nsid w:val="5C166FC3"/>
+    <w:multiLevelType w:val="hybridMultilevel"/>
+    <w:tmpl w:val="CA781D0A"/>
+    <w:lvl w:ilvl="0" w:tplc="04090001">
+      <w:start w:val="1"/>
+      <w:numFmt w:val="bullet"/>
+      <w:lvlText w:val=""/>
+      <w:lvlJc w:val="left"/>
+      <w:pPr>
+        <w:ind w:left="1440" w:hanging="360"/>
+      </w:pPr>
+      <w:rPr>
+        <w:rFonts w:ascii="Symbol" w:hAnsi="Symbol" w:hint="default"/>
+      </w:rPr>
+    </w:lvl>
+    <w:lvl w:ilvl="1" w:tplc="04090003" w:tentative="1">
+      <w:start w:val="1"/>
+      <w:numFmt w:val="bullet"/>
+      <w:lvlText w:val="o"/>
+      <w:lvlJc w:val="left"/>
+      <w:pPr>
+        <w:ind w:left="2160" w:hanging="360"/>
+      </w:pPr>
+      <w:rPr>
+        <w:rFonts w:ascii="Courier New" w:hAnsi="Courier New" w:cs="Courier New" w:hint="default"/>
+      </w:rPr>
+    </w:lvl>
+    <w:lvl w:ilvl="2" w:tplc="04090005" w:tentative="1">
+      <w:start w:val="1"/>
+      <w:numFmt w:val="bullet"/>
+      <w:lvlText w:val=""/>
+      <w:lvlJc w:val="left"/>
+      <w:pPr>
+        <w:ind w:left="2880" w:hanging="360"/>
+      </w:pPr>
+      <w:rPr>
+        <w:rFonts w:ascii="Wingdings" w:hAnsi="Wingdings" w:hint="default"/>
+      </w:rPr>
+    </w:lvl>
+    <w:lvl w:ilvl="3" w:tplc="04090001" w:tentative="1">
+      <w:start w:val="1"/>
+      <w:numFmt w:val="bullet"/>
+      <w:lvlText w:val=""/>
+      <w:lvlJc w:val="left"/>
+      <w:pPr>
+        <w:ind w:left="3600" w:hanging="360"/>
+      </w:pPr>
+      <w:rPr>
+        <w:rFonts w:ascii="Symbol" w:hAnsi="Symbol" w:hint="default"/>
+      </w:rPr>
+    </w:lvl>
+    <w:lvl w:ilvl="4" w:tplc="04090003" w:tentative="1">
+      <w:start w:val="1"/>
+      <w:numFmt w:val="bullet"/>
+      <w:lvlText w:val="o"/>
+      <w:lvlJc w:val="left"/>
+      <w:pPr>
+        <w:ind w:left="4320" w:hanging="360"/>
+      </w:pPr>
+      <w:rPr>
+        <w:rFonts w:ascii="Courier New" w:hAnsi="Courier New" w:cs="Courier New" w:hint="default"/>
+      </w:rPr>
+    </w:lvl>
+    <w:lvl w:ilvl="5" w:tplc="04090005" w:tentative="1">
+      <w:start w:val="1"/>
+      <w:numFmt w:val="bullet"/>
+      <w:lvlText w:val=""/>
+      <w:lvlJc w:val="left"/>
+      <w:pPr>
+        <w:ind w:left="5040" w:hanging="360"/>
+      </w:pPr>
+      <w:rPr>
+        <w:rFonts w:ascii="Wingdings" w:hAnsi="Wingdings" w:hint="default"/>
+      </w:rPr>
+    </w:lvl>
+    <w:lvl w:ilvl="6" w:tplc="04090001" w:tentative="1">
+      <w:start w:val="1"/>
+      <w:numFmt w:val="bullet"/>
+      <w:lvlText w:val=""/>
+      <w:lvlJc w:val="left"/>
+      <w:pPr>
+        <w:ind w:left="5760" w:hanging="360"/>
+      </w:pPr>
+      <w:rPr>
+        <w:rFonts w:ascii="Symbol" w:hAnsi="Symbol" w:hint="default"/>
+      </w:rPr>
+    </w:lvl>
+    <w:lvl w:ilvl="7" w:tplc="04090003" w:tentative="1">
+      <w:start w:val="1"/>
+      <w:numFmt w:val="bullet"/>
+      <w:lvlText w:val="o"/>
+      <w:lvlJc w:val="left"/>
+      <w:pPr>
+        <w:ind w:left="6480" w:hanging="360"/>
+      </w:pPr>
+      <w:rPr>
+        <w:rFonts w:ascii="Courier New" w:hAnsi="Courier New" w:cs="Courier New" w:hint="default"/>
+      </w:rPr>
+    </w:lvl>
+    <w:lvl w:ilvl="8" w:tplc="04090005" w:tentative="1">
+      <w:start w:val="1"/>
+      <w:numFmt w:val="bullet"/>
+      <w:lvlText w:val=""/>
+      <w:lvlJc w:val="left"/>
+      <w:pPr>
+        <w:ind w:left="7200" w:hanging="360"/>
+      </w:pPr>
+      <w:rPr>
+        <w:rFonts w:ascii="Wingdings" w:hAnsi="Wingdings" w:hint="default"/>
+      </w:rPr>
+    </w:lvl>
+  </w:abstractNum>
+  <w:abstractNum w:abstractNumId="15" w15:restartNumberingAfterBreak="0">
     <w:nsid w:val="5DDA5017"/>
     <w:multiLevelType w:val="hybridMultilevel"/>
-    <w:tmpl w:val="46C0B60A"/>
+    <w:tmpl w:val="3BB4C14A"/>
     <w:lvl w:ilvl="0" w:tplc="04090003">
       <w:start w:val="1"/>
       <w:numFmt w:val="bullet"/>
@@ -53611,10 +53915,10 @@
       </w:rPr>
     </w:lvl>
   </w:abstractNum>
-  <w:abstractNum w:abstractNumId="13" w15:restartNumberingAfterBreak="0">
+  <w:abstractNum w:abstractNumId="16" w15:restartNumberingAfterBreak="0">
     <w:nsid w:val="64B65F15"/>
     <w:multiLevelType w:val="hybridMultilevel"/>
-    <w:tmpl w:val="B956D11A"/>
+    <w:tmpl w:val="CFA2FB46"/>
     <w:lvl w:ilvl="0" w:tplc="04090003">
       <w:start w:val="1"/>
       <w:numFmt w:val="bullet"/>
@@ -53726,7 +54030,7 @@
       </w:rPr>
     </w:lvl>
   </w:abstractNum>
-  <w:abstractNum w:abstractNumId="14" w15:restartNumberingAfterBreak="0">
+  <w:abstractNum w:abstractNumId="17" w15:restartNumberingAfterBreak="0">
     <w:nsid w:val="678106B3"/>
     <w:multiLevelType w:val="hybridMultilevel"/>
     <w:tmpl w:val="1EFC320A"/>
@@ -53815,7 +54119,7 @@
       </w:pPr>
     </w:lvl>
   </w:abstractNum>
-  <w:abstractNum w:abstractNumId="15" w15:restartNumberingAfterBreak="0">
+  <w:abstractNum w:abstractNumId="18" w15:restartNumberingAfterBreak="0">
     <w:nsid w:val="6FB1242A"/>
     <w:multiLevelType w:val="multilevel"/>
     <w:tmpl w:val="32F67926"/>
@@ -53930,7 +54234,7 @@
       </w:rPr>
     </w:lvl>
   </w:abstractNum>
-  <w:abstractNum w:abstractNumId="16" w15:restartNumberingAfterBreak="0">
+  <w:abstractNum w:abstractNumId="19" w15:restartNumberingAfterBreak="0">
     <w:nsid w:val="71B466FF"/>
     <w:multiLevelType w:val="hybridMultilevel"/>
     <w:tmpl w:val="307C6134"/>
@@ -54026,7 +54330,7 @@
     <w:abstractNumId w:val="1"/>
   </w:num>
   <w:num w:numId="4" w16cid:durableId="1305159793">
-    <w:abstractNumId w:val="10"/>
+    <w:abstractNumId w:val="11"/>
   </w:num>
   <w:num w:numId="5" w16cid:durableId="598173589">
     <w:abstractNumId w:val="3"/>
@@ -54035,13 +54339,13 @@
     <w:abstractNumId w:val="9"/>
   </w:num>
   <w:num w:numId="7" w16cid:durableId="983389078">
-    <w:abstractNumId w:val="13"/>
+    <w:abstractNumId w:val="16"/>
   </w:num>
   <w:num w:numId="8" w16cid:durableId="595360051">
     <w:abstractNumId w:val="0"/>
   </w:num>
   <w:num w:numId="9" w16cid:durableId="121462866">
-    <w:abstractNumId w:val="15"/>
+    <w:abstractNumId w:val="18"/>
   </w:num>
   <w:num w:numId="10" w16cid:durableId="1028406469">
     <w:abstractNumId w:val="6"/>
@@ -54050,16 +54354,16 @@
     <w:abstractNumId w:val="5"/>
   </w:num>
   <w:num w:numId="12" w16cid:durableId="938491951">
-    <w:abstractNumId w:val="14"/>
+    <w:abstractNumId w:val="17"/>
   </w:num>
   <w:num w:numId="13" w16cid:durableId="629358744">
-    <w:abstractNumId w:val="11"/>
+    <w:abstractNumId w:val="12"/>
   </w:num>
   <w:num w:numId="14" w16cid:durableId="1242376873">
-    <w:abstractNumId w:val="12"/>
+    <w:abstractNumId w:val="15"/>
   </w:num>
   <w:num w:numId="15" w16cid:durableId="2042784571">
-    <w:abstractNumId w:val="16"/>
+    <w:abstractNumId w:val="19"/>
   </w:num>
   <w:num w:numId="16" w16cid:durableId="430901329">
     <w:abstractNumId w:val="7"/>
@@ -54071,10 +54375,10 @@
     <w:abstractNumId w:val="4"/>
   </w:num>
   <w:num w:numId="19" w16cid:durableId="1241720268">
-    <w:abstractNumId w:val="12"/>
+    <w:abstractNumId w:val="15"/>
   </w:num>
   <w:num w:numId="20" w16cid:durableId="571744195">
-    <w:abstractNumId w:val="16"/>
+    <w:abstractNumId w:val="19"/>
     <w:lvlOverride w:ilvl="0">
       <w:startOverride w:val="1"/>
     </w:lvlOverride>
@@ -54132,6 +54436,18 @@
     <w:lvlOverride w:ilvl="8">
       <w:startOverride w:val="1"/>
     </w:lvlOverride>
+  </w:num>
+  <w:num w:numId="22" w16cid:durableId="528955707">
+    <w:abstractNumId w:val="13"/>
+  </w:num>
+  <w:num w:numId="23" w16cid:durableId="375012971">
+    <w:abstractNumId w:val="0"/>
+  </w:num>
+  <w:num w:numId="24" w16cid:durableId="1252273326">
+    <w:abstractNumId w:val="14"/>
+  </w:num>
+  <w:num w:numId="25" w16cid:durableId="1956211937">
+    <w:abstractNumId w:val="10"/>
   </w:num>
 </w:numbering>
 </file>
@@ -54536,7 +54852,7 @@
   <w:style w:type="paragraph" w:default="1" w:styleId="a">
     <w:name w:val="Normal"/>
     <w:qFormat/>
-    <w:rsid w:val="005A75B1"/>
+    <w:rsid w:val="00FA7A45"/>
     <w:pPr>
       <w:bidi/>
       <w:spacing w:line="360" w:lineRule="auto"/>
@@ -54577,7 +54893,7 @@
     <w:uiPriority w:val="9"/>
     <w:unhideWhenUsed/>
     <w:qFormat/>
-    <w:rsid w:val="005E5B37"/>
+    <w:rsid w:val="00FA7A45"/>
     <w:pPr>
       <w:keepNext/>
       <w:keepLines/>
@@ -54585,7 +54901,8 @@
         <w:ilvl w:val="1"/>
         <w:numId w:val="1"/>
       </w:numPr>
-      <w:spacing w:before="40" w:after="0"/>
+      <w:spacing w:before="40" w:after="0" w:line="240" w:lineRule="auto"/>
+      <w:ind w:left="0"/>
       <w:outlineLvl w:val="1"/>
     </w:pPr>
     <w:rPr>
@@ -54777,6 +55094,7 @@
   <w:style w:type="character" w:default="1" w:styleId="a0">
     <w:name w:val="Default Paragraph Font"/>
     <w:uiPriority w:val="1"/>
+    <w:semiHidden/>
     <w:unhideWhenUsed/>
   </w:style>
   <w:style w:type="table" w:default="1" w:styleId="a1">
@@ -54805,7 +55123,7 @@
     <w:basedOn w:val="a0"/>
     <w:link w:val="2"/>
     <w:uiPriority w:val="9"/>
-    <w:rsid w:val="005E5B37"/>
+    <w:rsid w:val="00FA7A45"/>
     <w:rPr>
       <w:rFonts w:asciiTheme="majorHAnsi" w:eastAsiaTheme="majorEastAsia" w:hAnsiTheme="majorHAnsi" w:cstheme="majorBidi"/>
       <w:bCs/>

</xml_diff>